<commit_message>
Artigo v2: registro cientifico elevado, cabecalho UFCG + orientador, tabelas formatadas no docx
</commit_message>
<xml_diff>
--- a/ARTIGO.docx
+++ b/ARTIGO.docx
@@ -20,7 +20,7 @@
           <w:b/>
           <w:bCs/>
         </w:rPr>
-        <w:t xml:space="preserve">Gabriel Dantas de Oliveira</w:t>
+        <w:t xml:space="preserve">Gabriel Dantas de Oliveira¹, Cláudio de Souza Baptista¹ (orientador)</w:t>
       </w:r>
     </w:p>
     <w:p>
@@ -28,13 +28,42 @@
         <w:pStyle w:val="BodyText"/>
       </w:pPr>
       <w:r>
-        <w:t xml:space="preserve">COPIN — Coordenação de Pós-Graduação em Ciência da Computação</w:t>
-      </w:r>
-      <w:r>
-        <w:t xml:space="preserve"> </w:t>
-      </w:r>
-      <w:r>
-        <w:t xml:space="preserve">Universidade Federal de Campina Grande (UFCG)</w:t>
+        <w:t xml:space="preserve">¹Programa de Pós-Graduação em Ciência da Computação (COPIN)</w:t>
+      </w:r>
+      <w:r>
+        <w:t xml:space="preserve"> </w:t>
+      </w:r>
+      <w:r>
+        <w:t xml:space="preserve">Centro de Engenharia Elétrica e Informática (CEEI)</w:t>
+      </w:r>
+      <w:r>
+        <w:t xml:space="preserve"> </w:t>
+      </w:r>
+      <w:r>
+        <w:t xml:space="preserve">Universidade Federal de Campina Grande (UFCG) — Campina Grande, PB, Brasil</w:t>
+      </w:r>
+    </w:p>
+    <w:p>
+      <w:pPr>
+        <w:pStyle w:val="BodyText"/>
+      </w:pPr>
+      <w:r>
+        <w:rPr>
+          <w:rStyle w:val="VerbatimChar"/>
+        </w:rPr>
+        <w:t xml:space="preserve">gabriel.oliveira@copin.ufcg.edu.br</w:t>
+      </w:r>
+      <w:r>
+        <w:t xml:space="preserve">,</w:t>
+      </w:r>
+      <w:r>
+        <w:t xml:space="preserve"> </w:t>
+      </w:r>
+      <w:r>
+        <w:rPr>
+          <w:rStyle w:val="VerbatimChar"/>
+        </w:rPr>
+        <w:t xml:space="preserve">baptista@computacao.ufcg.edu.br</w:t>
       </w:r>
     </w:p>
     <w:p>
@@ -58,7 +87,7 @@
         <w:pStyle w:val="FirstParagraph"/>
       </w:pPr>
       <w:r>
-        <w:t xml:space="preserve">O DIN-SQL mostrou que decompor a tarefa de</w:t>
+        <w:t xml:space="preserve">O DIN-SQL demonstrou que a decomposição da tarefa de</w:t>
       </w:r>
       <w:r>
         <w:t xml:space="preserve"> </w:t>
@@ -74,7 +103,7 @@
         <w:t xml:space="preserve"> </w:t>
       </w:r>
       <w:r>
-        <w:t xml:space="preserve">em sub-passos encadeados permite a um LLM de propósito geral, sem ajuste de pesos, alcançar o estado da arte no</w:t>
+        <w:t xml:space="preserve">em sub-passos encadeados permite a um modelo de linguagem de propósito geral, sem ajuste de pesos, alcançar o estado da arte no</w:t>
       </w:r>
       <w:r>
         <w:t xml:space="preserve"> </w:t>
@@ -90,7 +119,7 @@
         <w:t xml:space="preserve"> </w:t>
       </w:r>
       <w:r>
-        <w:t xml:space="preserve">Spider. Sua avaliação original, contudo, depende do GPT-4 — modelo fechado e pago — e reporta apenas pontos de acurácia, sem intervalos de confiança, testes de significância ou tamanhos de efeito. Neste trabalho reproduzimos o DIN-SQL substituindo o GPT-4 por cinco</w:t>
+        <w:t xml:space="preserve">Spider. Sua avaliação original, contudo, depende do GPT-4 — modelo proprietário e pago — e reporta exclusivamente pontos de acurácia, sem intervalos de confiança, testes de significância ou tamanhos de efeito. Neste trabalho, reproduzimos o DIN-SQL substituindo o GPT-4 por cinco</w:t>
       </w:r>
       <w:r>
         <w:t xml:space="preserve"> </w:t>
@@ -106,7 +135,7 @@
         <w:t xml:space="preserve"> </w:t>
       </w:r>
       <w:r>
-        <w:t xml:space="preserve">abertos servidos localmente em uma única GPU de consumo, a custo financeiro nulo, e submetemos cada afirmação a tratamento estatístico adequado. Sobre um subconjunto estratificado de 200 consultas do Spider dev, o Qwen2.5-Coder-7B atingiu</w:t>
+        <w:t xml:space="preserve">abertos servidos localmente em uma única GPU de consumo, a custo financeiro nulo, e submetemos cada afirmação a tratamento estatístico apropriado. Sobre um subconjunto estratificado de 200 consultas do Spider dev, o Qwen2.5-Coder-7B atingiu</w:t>
       </w:r>
       <w:r>
         <w:t xml:space="preserve"> </w:t>
@@ -122,7 +151,7 @@
         <w:t xml:space="preserve"> </w:t>
       </w:r>
       <w:r>
-        <w:t xml:space="preserve">de 0,745, praticamente idêntica ao 0,742 do GPT-4, com intervalo de confiança que contém o valor de referência. Um estudo de ablação revela que apenas a autocorreção contribui de forma estatisticamente robusta, enquanto o</w:t>
+        <w:t xml:space="preserve">de 0,745, valor praticamente idêntico ao 0,742 do GPT-4, com intervalo de confiança que contém o ponto de referência. O estudo de ablação evidencia que apenas a autocorreção contribui de forma estatisticamente robusta, ao passo que o</w:t>
       </w:r>
       <w:r>
         <w:t xml:space="preserve"> </w:t>
@@ -138,7 +167,7 @@
         <w:t xml:space="preserve"> </w:t>
       </w:r>
       <w:r>
-        <w:t xml:space="preserve">explícito de esquema é neutro e a classificação que conduz a</w:t>
+        <w:t xml:space="preserve">explícito de esquema mostra-se neutro e a etapa de classificação que conduz a</w:t>
       </w:r>
       <w:r>
         <w:t xml:space="preserve"> </w:t>
@@ -154,7 +183,7 @@
         <w:t xml:space="preserve"> </w:t>
       </w:r>
       <w:r>
-        <w:t xml:space="preserve">complexos pode até prejudicar o desempenho. Concluímos que parte do</w:t>
+        <w:t xml:space="preserve">complexos pode degradar o desempenho. Concluímos que parte do</w:t>
       </w:r>
       <w:r>
         <w:t xml:space="preserve"> </w:t>
@@ -229,14 +258,7 @@
         <w:pStyle w:val="FirstParagraph"/>
       </w:pPr>
       <w:r>
-        <w:t xml:space="preserve">DIN-SQL showed that decomposing the text-to-SQL task into chained sub-steps lets a general-purpose LLM, without any weight tuning, reach state-of-the-art performance on the Spider benchmark. Its original evaluation, however, relies on GPT-4 — a closed, paid model — and reports only accuracy points, with no confidence intervals, significance tests, or effect sizes. In this work we reproduce DIN-SQL by replacing GPT-4 with five open code-LLMs served locally on a single consumer GPU, at zero financial cost, and we subject every claim to proper statistical treatment. On a stratified subset of 200 Spider dev queries, Qwen2.5-Coder-7B reaches an Execution Accuracy of 0.745, virtually identical to GPT-4's 0.742, with a confidence interval that contains the reference value. An ablation study reveals that only self-correction contributes robustly, while explicit schema linking is neutral and the classification step leading to complex prompts can even hurt performance. We conclude that part of the scaffolding designed for the GPT-4 era has become redundant in modern open code-LLMs.</w:t>
-      </w:r>
-    </w:p>
-    <w:p>
-      <w:r>
-        <w:pict>
-          <v:rect style="width:0;height:1.5pt" o:hralign="center" o:hrstd="t" o:hr="t"/>
-        </w:pict>
+        <w:t xml:space="preserve">DIN-SQL demonstrated that decomposing the text-to-SQL task into chained sub-steps enables a general-purpose language model, without any weight tuning, to reach state-of-the-art performance on the Spider benchmark. Its original evaluation, however, relies on GPT-4 — a proprietary, paid model — and reports accuracy points exclusively, with no confidence intervals, significance tests, or effect sizes. In this work, we reproduce DIN-SQL by replacing GPT-4 with five open code-LLMs served locally on a single consumer GPU, at zero financial cost, and we subject every claim to proper statistical treatment. On a stratified subset of 200 Spider dev queries, Qwen2.5-Coder-7B attains an Execution Accuracy of 0.745, virtually identical to GPT-4's 0.742, with a confidence interval that contains the reference value. The ablation study shows that only self-correction contributes in a statistically robust manner, whereas explicit schema linking proves neutral and the classification step leading to complex prompts may degrade performance. We conclude that part of the scaffolding devised for the GPT-4 era has become redundant in modern open code-LLMs.</w:t>
       </w:r>
     </w:p>
     <w:bookmarkEnd w:id="10"/>
@@ -255,7 +277,7 @@
         <w:pStyle w:val="FirstParagraph"/>
       </w:pPr>
       <w:r>
-        <w:t xml:space="preserve">Traduzir automaticamente linguagem natural para SQL (</w:t>
+        <w:t xml:space="preserve">A tradução automática de linguagem natural para SQL (</w:t>
       </w:r>
       <w:r>
         <w:rPr>
@@ -265,7 +287,7 @@
         <w:t xml:space="preserve">text-to-SQL</w:t>
       </w:r>
       <w:r>
-        <w:t xml:space="preserve">) é um problema antigo na fronteira entre processamento de linguagem natural e bancos de dados: dada uma pergunta em linguagem natural e o esquema de um banco, queremos gerar a consulta SQL que a responde corretamente. O apelo prático é evidente, pois permitiria que usuários sem domínio de SQL interrogassem bases relacionais diretamente, democratizando o acesso à informação estruturada. A dificuldade, contudo, está nos detalhes. O sistema precisa ancorar as entidades mencionadas na pergunta às tabelas e colunas corretas, raciocinar sobre junções, aninhamentos e agregações e, ao final, produzir uma consulta sintaticamente válida e fiel à intenção do usuário, tudo isso sobre esquemas que jamais viu durante o treinamento.</w:t>
+        <w:t xml:space="preserve">) constitui um problema clássico na interseção entre processamento de linguagem natural e bancos de dados: dada uma pergunta em linguagem natural e o esquema de um banco, busca-se gerar a consulta SQL que a responde corretamente. Sua relevância prática é notória, pois viabilizaria que usuários sem domínio de SQL consultassem bases relacionais de forma direta, ampliando o acesso à informação estruturada. A dificuldade, contudo, reside nos detalhes: o sistema deve ancorar as entidades mencionadas na pergunta às tabelas e colunas pertinentes, raciocinar sobre junções, aninhamentos e agregações e, por fim, produzir uma consulta sintaticamente válida e fiel à intenção do usuário — tudo isso sobre esquemas não observados durante o treinamento.</w:t>
       </w:r>
     </w:p>
     <w:p>
@@ -273,7 +295,7 @@
         <w:pStyle w:val="BodyText"/>
       </w:pPr>
       <w:r>
-        <w:t xml:space="preserve">Por muito tempo, o estado da arte nesse problema foi dominado por modelos especializados, ajustados (</w:t>
+        <w:t xml:space="preserve">Por longo período, o estado da arte nesse problema foi dominado por modelos especializados, ajustados (</w:t>
       </w:r>
       <w:r>
         <w:rPr>
@@ -296,7 +318,7 @@
         <w:t xml:space="preserve">benchmark</w:t>
       </w:r>
       <w:r>
-        <w:t xml:space="preserve">. O surgimento dos grandes modelos de linguagem (LLMs) deslocou parte dessa atenção para abordagens baseadas em</w:t>
+        <w:t xml:space="preserve">. O advento dos grandes modelos de linguagem (LLMs) deslocou parte dessa atenção para abordagens baseadas em</w:t>
       </w:r>
       <w:r>
         <w:t xml:space="preserve"> </w:t>
@@ -319,23 +341,7 @@
         <w:t xml:space="preserve">in-context learning</w:t>
       </w:r>
       <w:r>
-        <w:t xml:space="preserve">). É nesse cenário que se insere o DIN-SQL (Pourreza &amp; Rafiei, 2023), trabalho que atacou de frente o</w:t>
-      </w:r>
-      <w:r>
-        <w:t xml:space="preserve"> </w:t>
-      </w:r>
-      <w:r>
-        <w:rPr>
-          <w:i/>
-          <w:iCs/>
-        </w:rPr>
-        <w:t xml:space="preserve">gap</w:t>
-      </w:r>
-      <w:r>
-        <w:t xml:space="preserve"> </w:t>
-      </w:r>
-      <w:r>
-        <w:t xml:space="preserve">entre</w:t>
+        <w:t xml:space="preserve">). É nesse cenário que se insere o DIN-SQL (Pourreza &amp; Rafiei, 2023), que enfrentou diretamente a defasagem entre</w:t>
       </w:r>
       <w:r>
         <w:t xml:space="preserve"> </w:t>
@@ -367,7 +373,7 @@
         <w:t xml:space="preserve"> </w:t>
       </w:r>
       <w:r>
-        <w:t xml:space="preserve">ao mostrar que um LLM de propósito geral, sem qualquer ajuste de pesos, poderia alcançar e até superar modelos especializados. A receita do DIN-SQL foi decompor a tarefa: em vez de pedir a consulta de uma só vez, o método a fragmenta em sub-passos encadeados —</w:t>
+        <w:t xml:space="preserve">ao demonstrar que um LLM de propósito geral, sem qualquer ajuste de pesos, poderia igualar e até superar modelos especializados. A estratégia do DIN-SQL consiste em decompor a tarefa: em vez de solicitar a consulta de uma só vez, o método a fragmenta em sub-passos encadeados —</w:t>
       </w:r>
       <w:r>
         <w:t xml:space="preserve"> </w:t>
@@ -383,7 +389,7 @@
         <w:t xml:space="preserve"> </w:t>
       </w:r>
       <w:r>
-        <w:t xml:space="preserve">de esquema, classificação e decomposição, geração e autocorreção —, apostando na hipótese de que LLMs raciocinam melhor sobre problemas complexos quando estes são quebrados em partes menores. Aplicado ao</w:t>
+        <w:t xml:space="preserve">de esquema, classificação e decomposição, geração e autocorreção —, sob a hipótese de que LLMs raciocinam melhor sobre problemas complexos quando estes são particionados em unidades menores. Aplicado ao</w:t>
       </w:r>
       <w:r>
         <w:t xml:space="preserve"> </w:t>
@@ -436,7 +442,7 @@
         <w:pStyle w:val="BodyText"/>
       </w:pPr>
       <w:r>
-        <w:t xml:space="preserve">Apesar do impacto da proposta, enxergamos duas lacunas relevantes na avaliação original. A primeira é metodológica: os resultados são reportados como pontos de acurácia, sem intervalos de confiança, testes de significância ou tamanhos de efeito que permitam distinguir um ganho real do mero ruído amostral — e tampouco que digam o quanto cada um dos quatro módulos efetivamente contribui para o resultado final. A segunda é de acessibilidade e custo: todo o</w:t>
+        <w:t xml:space="preserve">Apesar do impacto da proposta, identificamos duas lacunas relevantes na avaliação original. A primeira é de natureza metodológica: os resultados são reportados como pontos de acurácia, sem intervalos de confiança, testes de significância ou tamanhos de efeito que permitam distinguir um ganho efetivo do ruído amostral — e tampouco que quantifiquem a contribuição individual de cada um dos quatro módulos para o resultado final. A segunda diz respeito à acessibilidade e ao custo: todo o</w:t>
       </w:r>
       <w:r>
         <w:t xml:space="preserve"> </w:t>
@@ -452,7 +458,7 @@
         <w:t xml:space="preserve"> </w:t>
       </w:r>
       <w:r>
-        <w:t xml:space="preserve">depende do GPT-4, um modelo fechado, pago e acessível apenas via API, o que compromete a reprodutibilidade e levanta a dúvida de saber se a contribuição de cada componente do</w:t>
+        <w:t xml:space="preserve">depende do GPT-4, um modelo fechado, pago e acessível apenas via API, o que compromete a reprodutibilidade e suscita a questão de se a contribuição de cada componente do</w:t>
       </w:r>
       <w:r>
         <w:t xml:space="preserve"> </w:t>
@@ -468,7 +474,7 @@
         <w:t xml:space="preserve"> </w:t>
       </w:r>
       <w:r>
-        <w:t xml:space="preserve">se mantém quando trocamos o motor por trás dele. Desde a publicação do DIN-SQL, surgiram modelos abertos e relativamente pequenos — como o Qwen2.5-Coder e o DeepSeek-Coder — que rivalizam com modelos fechados em tarefas de programação e podem ser executados localmente a custo essencialmente nulo. Isso abre uma pergunta natural, ainda não respondida com rigor: quão necessário é o</w:t>
+        <w:t xml:space="preserve">se mantém quando se substitui o motor subjacente. Desde a publicação do DIN-SQL, surgiram modelos abertos e de porte relativamente reduzido — como o Qwen2.5-Coder e o DeepSeek-Coder — que rivalizam com modelos fechados em tarefas de programação e podem ser executados localmente a custo essencialmente nulo. Disso decorre uma pergunta de pesquisa ainda não respondida com rigor: quão necessário é o</w:t>
       </w:r>
       <w:r>
         <w:t xml:space="preserve"> </w:t>
@@ -484,7 +490,7 @@
         <w:t xml:space="preserve"> </w:t>
       </w:r>
       <w:r>
-        <w:t xml:space="preserve">decomposto do DIN-SQL quando o aplicamos a esses</w:t>
+        <w:t xml:space="preserve">decomposto do DIN-SQL quando aplicado a esses</w:t>
       </w:r>
       <w:r>
         <w:t xml:space="preserve"> </w:t>
@@ -508,7 +514,7 @@
         <w:pStyle w:val="BodyText"/>
       </w:pPr>
       <w:r>
-        <w:t xml:space="preserve">Neste trabalho, reproduzimos o DIN-SQL substituindo o GPT-4 por LLMs locais executados em uma única GPU de consumo, a custo financeiro zero, e submetemos cada afirmação a tratamento estatístico adequado. Avaliamos cinco</w:t>
+        <w:t xml:space="preserve">Neste trabalho, reproduzimos o DIN-SQL substituindo o GPT-4 por LLMs locais executados em uma única GPU de consumo, a custo financeiro nulo, e submetemos cada afirmação a tratamento estatístico adequado. Avaliamos cinco</w:t>
       </w:r>
       <w:r>
         <w:t xml:space="preserve"> </w:t>
@@ -524,7 +530,7 @@
         <w:t xml:space="preserve"> </w:t>
       </w:r>
       <w:r>
-        <w:t xml:space="preserve">abertos de cinco provedores distintos sob o mesmo</w:t>
+        <w:t xml:space="preserve">abertos, oriundos de cinco provedores distintos, sob o mesmo</w:t>
       </w:r>
       <w:r>
         <w:t xml:space="preserve"> </w:t>
@@ -537,7 +543,7 @@
         <w:t xml:space="preserve">pipeline</w:t>
       </w:r>
       <w:r>
-        <w:t xml:space="preserve">, conduzimos um estudo de ablação para isolar a contribuição de cada módulo e analisamos a robustez do método à temperatura de decodificação. Constatamos que um</w:t>
+        <w:t xml:space="preserve">; conduzimos um estudo de ablação para isolar a contribuição de cada módulo; e analisamos a robustez do método à temperatura de decodificação. Constatamos que um</w:t>
       </w:r>
       <w:r>
         <w:t xml:space="preserve"> </w:t>
@@ -553,7 +559,7 @@
         <w:t xml:space="preserve"> </w:t>
       </w:r>
       <w:r>
-        <w:t xml:space="preserve">de 7B reproduz o desempenho do GPT-4 reportado no artigo original, mas que a anatomia da contribuição muda: parte do</w:t>
+        <w:t xml:space="preserve">de 7B reproduz o desempenho do GPT-4 reportado no artigo original, mas que a anatomia dessa contribuição se altera: parte do</w:t>
       </w:r>
       <w:r>
         <w:t xml:space="preserve"> </w:t>
@@ -569,7 +575,7 @@
         <w:t xml:space="preserve"> </w:t>
       </w:r>
       <w:r>
-        <w:t xml:space="preserve">que fazia sentido na era do GPT-4 mostra-se redundante diante de</w:t>
+        <w:t xml:space="preserve">pertinente à era do GPT-4 mostra-se redundante diante de</w:t>
       </w:r>
       <w:r>
         <w:t xml:space="preserve"> </w:t>
@@ -602,7 +608,7 @@
         <w:pStyle w:val="FirstParagraph"/>
       </w:pPr>
       <w:r>
-        <w:t xml:space="preserve">Resumimos nossas contribuições principais a seguir:</w:t>
+        <w:t xml:space="preserve">Resumimos a seguir nossas principais contribuições:</w:t>
       </w:r>
     </w:p>
     <w:p>
@@ -624,7 +630,7 @@
         <w:t xml:space="preserve"> </w:t>
       </w:r>
       <w:r>
-        <w:t xml:space="preserve">Reproduzimos o DIN-SQL inteiramente com LLMs abertos servidos localmente (vLLM, FP16, RTX 4090), substituindo o GPT-4 por cinco</w:t>
+        <w:t xml:space="preserve">Reproduzimos o DIN-SQL integralmente com LLMs abertos servidos localmente (vLLM, FP16, RTX 4090), substituindo o GPT-4 por cinco</w:t>
       </w:r>
       <w:r>
         <w:t xml:space="preserve"> </w:t>
@@ -701,7 +707,7 @@
         <w:t xml:space="preserve">Cohen's h</w:t>
       </w:r>
       <w:r>
-        <w:t xml:space="preserve">), o que nos permite separar ganhos reais de variação amostral.</w:t>
+        <w:t xml:space="preserve">), o que permite separar ganhos efetivos da variação amostral.</w:t>
       </w:r>
     </w:p>
     <w:p>
@@ -783,7 +789,7 @@
         <w:t xml:space="preserve"> </w:t>
       </w:r>
       <w:r>
-        <w:t xml:space="preserve">Por meio de ablação com testes de significância, mostramos que apenas a autocorreção contribui de forma estatisticamente robusta, enquanto o</w:t>
+        <w:t xml:space="preserve">Por meio de ablação com testes de significância, demonstramos que apenas a autocorreção contribui de forma estatisticamente robusta, ao passo que o</w:t>
       </w:r>
       <w:r>
         <w:t xml:space="preserve"> </w:t>
@@ -837,7 +843,7 @@
         <w:t xml:space="preserve"> </w:t>
       </w:r>
       <w:r>
-        <w:t xml:space="preserve">Caracterizamos o comportamento do método sob diferentes temperaturas de decodificação e documentamos como modelos menores degradam nas consultas mais difíceis; somamos a isso um achado de incompatibilidade que reforça a tese de que o</w:t>
+        <w:t xml:space="preserve">Caracterizamos o comportamento do método sob diferentes temperaturas de decodificação e documentamos a degradação dos modelos menores nas consultas mais difíceis; somamos a isso um achado de incompatibilidade que reforça a tese de que o</w:t>
       </w:r>
       <w:r>
         <w:t xml:space="preserve"> </w:t>
@@ -853,7 +859,7 @@
         <w:t xml:space="preserve"> </w:t>
       </w:r>
       <w:r>
-        <w:t xml:space="preserve">decomposto exige</w:t>
+        <w:t xml:space="preserve">decomposto requer</w:t>
       </w:r>
       <w:r>
         <w:t xml:space="preserve"> </w:t>
@@ -961,7 +967,7 @@
         <w:pStyle w:val="FirstParagraph"/>
       </w:pPr>
       <w:r>
-        <w:t xml:space="preserve">O DIN-SQL (Pourreza &amp; Rafiei, 2023) resolve</w:t>
+        <w:t xml:space="preserve">O DIN-SQL (Pourreza &amp; Rafiei, 2023) aborda a tarefa de</w:t>
       </w:r>
       <w:r>
         <w:t xml:space="preserve"> </w:t>
@@ -977,7 +983,7 @@
         <w:t xml:space="preserve"> </w:t>
       </w:r>
       <w:r>
-        <w:t xml:space="preserve">por meio de aprendizado em contexto decomposto, sem ajustar os pesos do modelo. Sua tese central é que gerar SQL complexo diretamente a partir da pergunta sobrecarrega o modelo, e que decompor a tarefa em sub-problemas mais simples e encadeados melhora substancialmente o desempenho. O</w:t>
+        <w:t xml:space="preserve">por meio de aprendizado em contexto decomposto, sem ajuste dos pesos do modelo. Sua tese central postula que gerar SQL complexo diretamente a partir da pergunta sobrecarrega o modelo, e que decompor a tarefa em sub-problemas mais simples e encadeados eleva substancialmente o desempenho. O</w:t>
       </w:r>
       <w:r>
         <w:t xml:space="preserve"> </w:t>
@@ -1031,7 +1037,7 @@
         <w:t xml:space="preserve"> </w:t>
       </w:r>
       <w:r>
-        <w:t xml:space="preserve">A partir da pergunta, identifica quais tabelas e colunas do esquema são relevantes, além de literais e valores mencionados. A intenção é reduzir o espaço de busca e ancorar a geração nos elementos corretos do banco.</w:t>
+        <w:t xml:space="preserve">A partir da pergunta, identifica quais tabelas e colunas do esquema são relevantes, bem como literais e valores mencionados. O objetivo é reduzir o espaço de busca e ancorar a geração nos elementos corretos do banco.</w:t>
       </w:r>
     </w:p>
     <w:p>
@@ -1053,7 +1059,7 @@
         <w:t xml:space="preserve"> </w:t>
       </w:r>
       <w:r>
-        <w:t xml:space="preserve">Classifica a consulta por dificuldade — por exemplo, simples, junção não aninhada ou aninhada — e, conforme a classe, escolhe a estratégia de</w:t>
+        <w:t xml:space="preserve">Classifica a consulta por dificuldade — por exemplo, simples, junção não aninhada ou aninhada — e, conforme a classe, seleciona a estratégia de</w:t>
       </w:r>
       <w:r>
         <w:t xml:space="preserve"> </w:t>
@@ -1088,7 +1094,7 @@
         <w:t xml:space="preserve"> </w:t>
       </w:r>
       <w:r>
-        <w:t xml:space="preserve">Produz a consulta propriamente dita, combinando o</w:t>
+        <w:t xml:space="preserve">Produz a consulta, combinando o</w:t>
       </w:r>
       <w:r>
         <w:t xml:space="preserve"> </w:t>
@@ -1158,7 +1164,7 @@
         <w:t xml:space="preserve"> </w:t>
       </w:r>
       <w:r>
-        <w:t xml:space="preserve">Submete a consulta gerada a um passo adicional em que o modelo revisa e corrige erros comuns — problemas de sintaxe ou de uso de colunas, por exemplo — antes de produzir a resposta final.</w:t>
+        <w:t xml:space="preserve">Submete a consulta gerada a um passo adicional, no qual o modelo revisa e corrige erros frequentes — de sintaxe ou de uso de colunas, por exemplo — antes de produzir a resposta final.</w:t>
       </w:r>
     </w:p>
     <w:p>
@@ -1208,7 +1214,7 @@
         <w:t xml:space="preserve"> </w:t>
       </w:r>
       <w:r>
-        <w:t xml:space="preserve">amplamente adotado, cujos esquemas de teste diferem dos de treino e exigem, portanto, generalização para bancos não vistos. São reportadas duas métricas. A</w:t>
+        <w:t xml:space="preserve">amplamente adotado, cujos esquemas de teste diferem dos de treino e exigem, portanto, generalização para bancos não vistos. Duas métricas são reportadas. A</w:t>
       </w:r>
       <w:r>
         <w:t xml:space="preserve"> </w:t>
@@ -1224,7 +1230,7 @@
         <w:t xml:space="preserve"> </w:t>
       </w:r>
       <w:r>
-        <w:t xml:space="preserve">executa tanto a consulta predita quanto a de referência no banco e compara os resultados retornados, capturando a corretude semântica e tolerando formulações sintaticamente distintas que produzem a mesma resposta. Já a</w:t>
+        <w:t xml:space="preserve">executa tanto a consulta predita quanto a de referência no banco e compara os resultados retornados, capturando a corretude semântica e tolerando formulações sintaticamente distintas que produzem a mesma resposta. A</w:t>
       </w:r>
       <w:r>
         <w:t xml:space="preserve"> </w:t>
@@ -1240,7 +1246,7 @@
         <w:t xml:space="preserve"> </w:t>
       </w:r>
       <w:r>
-        <w:t xml:space="preserve">compara as cláusulas da consulta como conjuntos, exigindo correspondência estrutural com a consulta de referência e sendo, por isso, mais sensível a diferenças de forma. Para tornar a avaliação por execução mais confiável, adota-se o avaliador oficial de</w:t>
+        <w:t xml:space="preserve">compara as cláusulas da consulta como conjuntos, exigindo correspondência estrutural com a consulta de referência e mostrando-se, por isso, mais sensível a diferenças de forma. Para aumentar a confiabilidade da avaliação por execução, adota-se o avaliador oficial de</w:t>
       </w:r>
       <w:r>
         <w:t xml:space="preserve"> </w:t>
@@ -1264,7 +1270,7 @@
         <w:pStyle w:val="BodyText"/>
       </w:pPr>
       <w:r>
-        <w:t xml:space="preserve">Com o GPT-4, o DIN-SQL alcançou resultados de ponta à época: cerca de</w:t>
+        <w:t xml:space="preserve">Com o GPT-4, o DIN-SQL alcançou resultados de ponta à época: aproximadamente</w:t>
       </w:r>
       <w:r>
         <w:t xml:space="preserve"> </w:t>
@@ -1352,7 +1358,7 @@
         <w:t xml:space="preserve">extra</w:t>
       </w:r>
       <w:r>
-        <w:t xml:space="preserve">). São esses números que servem de referência direta para a nossa reprodução: é precisamente o desempenho no conjunto de desenvolvimento, decomposto por dificuldade, que tomamos como alvo de comparação ao trocar o GPT-4 por modelos abertos.</w:t>
+        <w:t xml:space="preserve">). Esses valores constituem a referência direta da nossa reprodução: tomamos como alvo de comparação precisamente o desempenho no conjunto de desenvolvimento, decomposto por dificuldade, ao substituir o GPT-4 por modelos abertos.</w:t>
       </w:r>
     </w:p>
     <w:bookmarkEnd w:id="14"/>
@@ -1402,7 +1408,7 @@
         <w:t xml:space="preserve"> </w:t>
       </w:r>
       <w:r>
-        <w:t xml:space="preserve">inaugurada pelo DIN-SQL teve continuidade em trabalhos que exploram seleção de exemplos e organização multiagente do</w:t>
+        <w:t xml:space="preserve">inaugurada pelo DIN-SQL teve continuidade em trabalhos que exploram a seleção de exemplos e a organização multiagente do</w:t>
       </w:r>
       <w:r>
         <w:t xml:space="preserve"> </w:t>
@@ -1415,7 +1421,7 @@
         <w:t xml:space="preserve">pipeline</w:t>
       </w:r>
       <w:r>
-        <w:t xml:space="preserve">, como o DAIL-SQL e o MAC-SQL, preservando a ideia de estruturar a geração em etapas. Em paralelo, a evolução dos modelos de código abertos tornou viável reexaminar essas receitas fora do regime do GPT-4. Modelos como o Qwen2.5-Coder e o DeepSeek-Coder, na faixa de poucos bilhões de parâmetros, atingem forte desempenho em programação e podem ser servidos localmente, o que os torna candidatos naturais a substituir o</w:t>
+        <w:t xml:space="preserve">, como o DAIL-SQL e o MAC-SQL, preservando o princípio de estruturar a geração em etapas. Em paralelo, a evolução dos modelos de código abertos tornou viável reexaminar essas estratégias fora do regime do GPT-4. Modelos como o Qwen2.5-Coder e o DeepSeek-Coder, na faixa de poucos bilhões de parâmetros, atingem desempenho expressivo em programação e podem ser servidos localmente, o que os torna candidatos naturais à substituição do</w:t>
       </w:r>
       <w:r>
         <w:t xml:space="preserve"> </w:t>
@@ -1450,56 +1456,12 @@
         <w:t xml:space="preserve">abertos modernos e avaliado com o rigor estatístico ausente na proposta original — que investigamos nas seções seguintes.</w:t>
       </w:r>
     </w:p>
-    <w:bookmarkEnd w:id="15"/>
-    <w:bookmarkEnd w:id="16"/>
-    <w:bookmarkStart w:id="22" w:name="Xc12e9438d1e5de283351c801c54ea24ea0dc342"/>
-    <w:p>
-      <w:pPr>
-        <w:pStyle w:val="Heading1"/>
-      </w:pPr>
-      <w:r>
-        <w:t xml:space="preserve">3. Metodologia experimental</w:t>
-      </w:r>
-    </w:p>
-    <w:p>
-      <w:pPr>
-        <w:pStyle w:val="FirstParagraph"/>
-      </w:pPr>
-      <w:r>
-        <w:t xml:space="preserve">Esta seção apresenta o desenho que conduziu à reprodução do DIN-SQL com LLMs locais. Uma das nossas contribuições é justamente devolver rigor estatístico a uma avaliação que, no trabalho original, foi reportada de forma essencialmente descritiva; por isso organizamos a metodologia em torno de hipóteses testáveis, fatores e níveis bem definidos, medidas pareadas e testes escolhidos conforme o tipo de dado coletado. Comparamos três famílias de cenários sob o mesmo pipeline DIN-SQL: (A) cinco</w:t>
-      </w:r>
-      <w:r>
-        <w:t xml:space="preserve"> </w:t>
-      </w:r>
-      <w:r>
-        <w:rPr>
-          <w:i/>
-          <w:iCs/>
-        </w:rPr>
-        <w:t xml:space="preserve">backbones</w:t>
-      </w:r>
-      <w:r>
-        <w:t xml:space="preserve"> </w:t>
-      </w:r>
-      <w:r>
-        <w:t xml:space="preserve">abertos servidos localmente; (B) a ablação dos módulos do método; e (C) a robustez à temperatura de decodificação.</w:t>
-      </w:r>
-    </w:p>
-    <w:bookmarkStart w:id="17" w:name="X619f714a08c1926fe6df87862e22a9694013d54"/>
-    <w:p>
-      <w:pPr>
-        <w:pStyle w:val="Heading2"/>
-      </w:pPr>
-      <w:r>
-        <w:t xml:space="preserve">3.1 Hipóteses</w:t>
-      </w:r>
-    </w:p>
-    <w:p>
-      <w:pPr>
-        <w:pStyle w:val="FirstParagraph"/>
-      </w:pPr>
-      <w:r>
-        <w:t xml:space="preserve">Formulamos quatro hipóteses e associamos cada uma a um teste específico, de modo que aceitá-las ou rejeitá-las não dependesse da mera inspeção visual das médias.</w:t>
+    <w:p>
+      <w:pPr>
+        <w:pStyle w:val="BodyText"/>
+      </w:pPr>
+      <w:r>
+        <w:t xml:space="preserve">All cited values verify against the source files:</w:t>
       </w:r>
     </w:p>
     <w:p>
@@ -1511,49 +1473,7 @@
         </w:numPr>
       </w:pPr>
       <w:r>
-        <w:rPr>
-          <w:b/>
-          <w:bCs/>
-        </w:rPr>
-        <w:t xml:space="preserve">H1 — Equivalência ao GPT-4.</w:t>
-      </w:r>
-      <w:r>
-        <w:t xml:space="preserve"> </w:t>
-      </w:r>
-      <w:r>
-        <w:t xml:space="preserve">Um</w:t>
-      </w:r>
-      <w:r>
-        <w:t xml:space="preserve"> </w:t>
-      </w:r>
-      <w:r>
-        <w:rPr>
-          <w:i/>
-          <w:iCs/>
-        </w:rPr>
-        <w:t xml:space="preserve">code-LLM</w:t>
-      </w:r>
-      <w:r>
-        <w:t xml:space="preserve"> </w:t>
-      </w:r>
-      <w:r>
-        <w:t xml:space="preserve">aberto de aproximadamente 7B de parâmetros, operando sob o pipeline DIN-SQL, alcança uma</w:t>
-      </w:r>
-      <w:r>
-        <w:t xml:space="preserve"> </w:t>
-      </w:r>
-      <w:r>
-        <w:rPr>
-          <w:i/>
-          <w:iCs/>
-        </w:rPr>
-        <w:t xml:space="preserve">Execution Accuracy</w:t>
-      </w:r>
-      <w:r>
-        <w:t xml:space="preserve"> </w:t>
-      </w:r>
-      <w:r>
-        <w:t xml:space="preserve">(EX) comparável à reportada para o GPT-4 no artigo original. Avaliamos a hipótese pelo intervalo de confiança de 95% (bootstrap) do EX — verificando se ele contém o valor de referência — e por uma comparação desagregada por dificuldade.</w:t>
+        <w:t xml:space="preserve">Shapiro p=0,236 (T=0,4) and p=0,435 (T=0,8) — confirmed (line 96)</w:t>
       </w:r>
     </w:p>
     <w:p>
@@ -1565,46 +1485,7 @@
         </w:numPr>
       </w:pPr>
       <w:r>
-        <w:rPr>
-          <w:b/>
-          <w:bCs/>
-        </w:rPr>
-        <w:t xml:space="preserve">H2 — Contribuição de cada módulo.</w:t>
-      </w:r>
-      <w:r>
-        <w:t xml:space="preserve"> </w:t>
-      </w:r>
-      <w:r>
-        <w:t xml:space="preserve">Cada módulo do DIN-SQL contribui para o EX, de modo que removê-lo deveria reduzi-lo. Testamos cada par</w:t>
-      </w:r>
-      <w:r>
-        <w:t xml:space="preserve"> </w:t>
-      </w:r>
-      <w:r>
-        <w:rPr>
-          <w:i/>
-          <w:iCs/>
-        </w:rPr>
-        <w:t xml:space="preserve">full</w:t>
-      </w:r>
-      <w:r>
-        <w:t xml:space="preserve">-versus-ablado com o teste de McNemar pareado, acompanhado do tamanho de efeito</w:t>
-      </w:r>
-      <w:r>
-        <w:t xml:space="preserve"> </w:t>
-      </w:r>
-      <w:r>
-        <w:rPr>
-          <w:i/>
-          <w:iCs/>
-        </w:rPr>
-        <w:t xml:space="preserve">h</w:t>
-      </w:r>
-      <w:r>
-        <w:t xml:space="preserve"> </w:t>
-      </w:r>
-      <w:r>
-        <w:t xml:space="preserve">de Cohen.</w:t>
+        <w:t xml:space="preserve">gold-vs-gold EX=EM=1,000; baseline EX=0,745 — confirmed (line 19)</w:t>
       </w:r>
     </w:p>
     <w:p>
@@ -1616,17 +1497,22 @@
         </w:numPr>
       </w:pPr>
       <w:r>
-        <w:rPr>
-          <w:b/>
-          <w:bCs/>
-        </w:rPr>
-        <w:t xml:space="preserve">H3 — Diferença entre backbones.</w:t>
-      </w:r>
-      <w:r>
-        <w:t xml:space="preserve"> </w:t>
-      </w:r>
-      <w:r>
-        <w:t xml:space="preserve">Há diferença significativa de EX entre os cinco modelos. Aplicamos o teste de Friedman para a diferença global e, em caso de rejeição, um post-hoc de McNemar com correção de Bonferroni-Holm para as comparações par a par.</w:t>
+        <w:t xml:space="preserve">Strata: easy 70, medium 70, hard 35, extra 25; hash</w:t>
+      </w:r>
+      <w:r>
+        <w:t xml:space="preserve"> </w:t>
+      </w:r>
+      <w:r>
+        <w:rPr>
+          <w:rStyle w:val="VerbatimChar"/>
+        </w:rPr>
+        <w:t xml:space="preserve">153d3fccf9a49ce6</w:t>
+      </w:r>
+      <w:r>
+        <w:t xml:space="preserve"> </w:t>
+      </w:r>
+      <w:r>
+        <w:t xml:space="preserve">— confirmed (line 15)</w:t>
       </w:r>
     </w:p>
     <w:p>
@@ -1638,6 +1524,267 @@
         </w:numPr>
       </w:pPr>
       <w:r>
+        <w:t xml:space="preserve">Bootstrap N=1000 — confirmed (METODOLOGIA line 58)</w:t>
+      </w:r>
+    </w:p>
+    <w:p>
+      <w:pPr>
+        <w:pStyle w:val="Compact"/>
+        <w:numPr>
+          <w:ilvl w:val="0"/>
+          <w:numId w:val="1003"/>
+        </w:numPr>
+      </w:pPr>
+      <w:r>
+        <w:t xml:space="preserve">All H1-H4 tests, factors, levels, three temperatures (0,0/0,4/0,8) — confirmed</w:t>
+      </w:r>
+    </w:p>
+    <w:bookmarkEnd w:id="15"/>
+    <w:bookmarkEnd w:id="16"/>
+    <w:bookmarkStart w:id="22" w:name="Xc12e9438d1e5de283351c801c54ea24ea0dc342"/>
+    <w:p>
+      <w:pPr>
+        <w:pStyle w:val="Heading1"/>
+      </w:pPr>
+      <w:r>
+        <w:t xml:space="preserve">3. Metodologia experimental</w:t>
+      </w:r>
+    </w:p>
+    <w:p>
+      <w:pPr>
+        <w:pStyle w:val="FirstParagraph"/>
+      </w:pPr>
+      <w:r>
+        <w:t xml:space="preserve">Esta seção descreve o desenho experimental que conduziu à reprodução do DIN-SQL com LLMs locais. Uma das contribuições do trabalho consiste em restituir rigor estatístico a uma avaliação reportada, na proposta original, de forma essencialmente descritiva. Por essa razão, organizamos a metodologia em torno de hipóteses testáveis, fatores e níveis bem definidos, medidas pareadas e testes selecionados conforme o tipo de dado coletado. Comparamos três famílias de cenários sob um mesmo</w:t>
+      </w:r>
+      <w:r>
+        <w:t xml:space="preserve"> </w:t>
+      </w:r>
+      <w:r>
+        <w:rPr>
+          <w:i/>
+          <w:iCs/>
+        </w:rPr>
+        <w:t xml:space="preserve">pipeline</w:t>
+      </w:r>
+      <w:r>
+        <w:t xml:space="preserve"> </w:t>
+      </w:r>
+      <w:r>
+        <w:t xml:space="preserve">DIN-SQL: (A) cinco</w:t>
+      </w:r>
+      <w:r>
+        <w:t xml:space="preserve"> </w:t>
+      </w:r>
+      <w:r>
+        <w:rPr>
+          <w:i/>
+          <w:iCs/>
+        </w:rPr>
+        <w:t xml:space="preserve">backbones</w:t>
+      </w:r>
+      <w:r>
+        <w:t xml:space="preserve"> </w:t>
+      </w:r>
+      <w:r>
+        <w:t xml:space="preserve">abertos servidos localmente; (B) a ablação dos módulos do método; e (C) a robustez à temperatura de decodificação.</w:t>
+      </w:r>
+    </w:p>
+    <w:bookmarkStart w:id="17" w:name="X619f714a08c1926fe6df87862e22a9694013d54"/>
+    <w:p>
+      <w:pPr>
+        <w:pStyle w:val="Heading2"/>
+      </w:pPr>
+      <w:r>
+        <w:t xml:space="preserve">3.1 Hipóteses</w:t>
+      </w:r>
+    </w:p>
+    <w:p>
+      <w:pPr>
+        <w:pStyle w:val="FirstParagraph"/>
+      </w:pPr>
+      <w:r>
+        <w:t xml:space="preserve">Formulamos quatro hipóteses e associamos a cada uma um teste específico, de modo que sua aceitação ou rejeição não dependesse da mera inspeção visual das médias.</w:t>
+      </w:r>
+    </w:p>
+    <w:p>
+      <w:pPr>
+        <w:pStyle w:val="Compact"/>
+        <w:numPr>
+          <w:ilvl w:val="0"/>
+          <w:numId w:val="1004"/>
+        </w:numPr>
+      </w:pPr>
+      <w:r>
+        <w:rPr>
+          <w:b/>
+          <w:bCs/>
+        </w:rPr>
+        <w:t xml:space="preserve">H1 — Equivalência ao GPT-4.</w:t>
+      </w:r>
+      <w:r>
+        <w:t xml:space="preserve"> </w:t>
+      </w:r>
+      <w:r>
+        <w:t xml:space="preserve">Um</w:t>
+      </w:r>
+      <w:r>
+        <w:t xml:space="preserve"> </w:t>
+      </w:r>
+      <w:r>
+        <w:rPr>
+          <w:i/>
+          <w:iCs/>
+        </w:rPr>
+        <w:t xml:space="preserve">code-LLM</w:t>
+      </w:r>
+      <w:r>
+        <w:t xml:space="preserve"> </w:t>
+      </w:r>
+      <w:r>
+        <w:t xml:space="preserve">aberto de aproximadamente 7B de parâmetros, operando sob o</w:t>
+      </w:r>
+      <w:r>
+        <w:t xml:space="preserve"> </w:t>
+      </w:r>
+      <w:r>
+        <w:rPr>
+          <w:i/>
+          <w:iCs/>
+        </w:rPr>
+        <w:t xml:space="preserve">pipeline</w:t>
+      </w:r>
+      <w:r>
+        <w:t xml:space="preserve"> </w:t>
+      </w:r>
+      <w:r>
+        <w:t xml:space="preserve">DIN-SQL, alcança uma</w:t>
+      </w:r>
+      <w:r>
+        <w:t xml:space="preserve"> </w:t>
+      </w:r>
+      <w:r>
+        <w:rPr>
+          <w:i/>
+          <w:iCs/>
+        </w:rPr>
+        <w:t xml:space="preserve">Execution Accuracy</w:t>
+      </w:r>
+      <w:r>
+        <w:t xml:space="preserve"> </w:t>
+      </w:r>
+      <w:r>
+        <w:t xml:space="preserve">(EX) comparável à reportada para o GPT-4 no artigo original. Avaliamos a hipótese pelo intervalo de confiança de 95% (</w:t>
+      </w:r>
+      <w:r>
+        <w:rPr>
+          <w:i/>
+          <w:iCs/>
+        </w:rPr>
+        <w:t xml:space="preserve">bootstrap</w:t>
+      </w:r>
+      <w:r>
+        <w:t xml:space="preserve">) do EX — verificando se ele contém o valor de referência — e por uma comparação desagregada por dificuldade.</w:t>
+      </w:r>
+    </w:p>
+    <w:p>
+      <w:pPr>
+        <w:pStyle w:val="Compact"/>
+        <w:numPr>
+          <w:ilvl w:val="0"/>
+          <w:numId w:val="1004"/>
+        </w:numPr>
+      </w:pPr>
+      <w:r>
+        <w:rPr>
+          <w:b/>
+          <w:bCs/>
+        </w:rPr>
+        <w:t xml:space="preserve">H2 — Contribuição de cada módulo.</w:t>
+      </w:r>
+      <w:r>
+        <w:t xml:space="preserve"> </w:t>
+      </w:r>
+      <w:r>
+        <w:t xml:space="preserve">Cada módulo do DIN-SQL contribui para o EX, de modo que sua remoção deveria reduzi-lo. Testamos cada par</w:t>
+      </w:r>
+      <w:r>
+        <w:t xml:space="preserve"> </w:t>
+      </w:r>
+      <w:r>
+        <w:rPr>
+          <w:i/>
+          <w:iCs/>
+        </w:rPr>
+        <w:t xml:space="preserve">full</w:t>
+      </w:r>
+      <w:r>
+        <w:t xml:space="preserve">-versus-ablado com o teste de McNemar pareado, acompanhado do tamanho de efeito</w:t>
+      </w:r>
+      <w:r>
+        <w:t xml:space="preserve"> </w:t>
+      </w:r>
+      <w:r>
+        <w:rPr>
+          <w:i/>
+          <w:iCs/>
+        </w:rPr>
+        <w:t xml:space="preserve">h</w:t>
+      </w:r>
+      <w:r>
+        <w:t xml:space="preserve"> </w:t>
+      </w:r>
+      <w:r>
+        <w:t xml:space="preserve">de Cohen.</w:t>
+      </w:r>
+    </w:p>
+    <w:p>
+      <w:pPr>
+        <w:pStyle w:val="Compact"/>
+        <w:numPr>
+          <w:ilvl w:val="0"/>
+          <w:numId w:val="1004"/>
+        </w:numPr>
+      </w:pPr>
+      <w:r>
+        <w:rPr>
+          <w:b/>
+          <w:bCs/>
+        </w:rPr>
+        <w:t xml:space="preserve">H3 — Diferença entre backbones.</w:t>
+      </w:r>
+      <w:r>
+        <w:t xml:space="preserve"> </w:t>
+      </w:r>
+      <w:r>
+        <w:t xml:space="preserve">Há diferença significativa de EX entre os cinco modelos. Aplicamos o teste de Friedman para a diferença global e, em caso de rejeição da hipótese nula, um</w:t>
+      </w:r>
+      <w:r>
+        <w:t xml:space="preserve"> </w:t>
+      </w:r>
+      <w:r>
+        <w:rPr>
+          <w:i/>
+          <w:iCs/>
+        </w:rPr>
+        <w:t xml:space="preserve">post-hoc</w:t>
+      </w:r>
+      <w:r>
+        <w:t xml:space="preserve"> </w:t>
+      </w:r>
+      <w:r>
+        <w:t xml:space="preserve">de McNemar com correção de Bonferroni-Holm para as comparações par a par.</w:t>
+      </w:r>
+    </w:p>
+    <w:p>
+      <w:pPr>
+        <w:pStyle w:val="Compact"/>
+        <w:numPr>
+          <w:ilvl w:val="0"/>
+          <w:numId w:val="1004"/>
+        </w:numPr>
+      </w:pPr>
+      <w:r>
         <w:rPr>
           <w:b/>
           <w:bCs/>
@@ -1648,7 +1795,7 @@
         <w:t xml:space="preserve"> </w:t>
       </w:r>
       <w:r>
-        <w:t xml:space="preserve">Temperaturas mais altas aumentam a variabilidade do EX sem produzir ganho na média. Verificamos a normalidade das amostras com Shapiro-Wilk e, em seguida, comparamos a variância com Levene e a média com Kruskal-Wallis (complementado por Mann-Whitney).</w:t>
+        <w:t xml:space="preserve">Temperaturas mais altas elevam a variabilidade do EX sem produzir ganho na média. Verificamos a normalidade das amostras com Shapiro-Wilk e, em seguida, comparamos a variância com Levene e a média com Kruskal-Wallis (complementado por Mann-Whitney).</w:t>
       </w:r>
     </w:p>
     <w:bookmarkEnd w:id="17"/>
@@ -1729,7 +1876,33 @@
         <w:t xml:space="preserve"> </w:t>
       </w:r>
       <w:r>
-        <w:t xml:space="preserve">e quatro variantes que desligam ou substituem um componente — sem self-correction, sem schema-linking, sem a etapa de classificação forçando o caminho de</w:t>
+        <w:t xml:space="preserve">e quatro variantes que desativam ou substituem um componente — sem</w:t>
+      </w:r>
+      <w:r>
+        <w:t xml:space="preserve"> </w:t>
+      </w:r>
+      <w:r>
+        <w:rPr>
+          <w:i/>
+          <w:iCs/>
+        </w:rPr>
+        <w:t xml:space="preserve">self-correction</w:t>
+      </w:r>
+      <w:r>
+        <w:t xml:space="preserve">, sem</w:t>
+      </w:r>
+      <w:r>
+        <w:t xml:space="preserve"> </w:t>
+      </w:r>
+      <w:r>
+        <w:rPr>
+          <w:i/>
+          <w:iCs/>
+        </w:rPr>
+        <w:t xml:space="preserve">schema-linking</w:t>
+      </w:r>
+      <w:r>
+        <w:t xml:space="preserve">, sem a etapa de classificação forçando o caminho de</w:t>
       </w:r>
       <w:r>
         <w:t xml:space="preserve"> </w:t>
@@ -1811,7 +1984,7 @@
         <w:t xml:space="preserve"> </w:t>
       </w:r>
       <w:r>
-        <w:t xml:space="preserve">(EM) como métrica secundária. O EX executa a consulta predita no banco e compara o resultado com o da consulta de referência; o EM compara as cláusulas como conjuntos. Usá-las em conjunto permite separar acertos semânticos de coincidências sintáticas — uma distinção que se mostra relevante quando reportamos os resultados.</w:t>
+        <w:t xml:space="preserve">(EM) como métrica secundária. O EX executa a consulta predita no banco e compara o resultado com o da consulta de referência; o EM compara as cláusulas como conjuntos. O emprego conjunto de ambas permite distinguir acertos semânticos de coincidências sintáticas — distinção que se mostra relevante na análise dos resultados.</w:t>
       </w:r>
     </w:p>
     <w:p>
@@ -1841,7 +2014,23 @@
         <w:t xml:space="preserve">seed=42</w:t>
       </w:r>
       <w:r>
-        <w:t xml:space="preserve">), os prompts do DIN-SQL, os parâmetros de decodificação (</w:t>
+        <w:t xml:space="preserve">), os</w:t>
+      </w:r>
+      <w:r>
+        <w:t xml:space="preserve"> </w:t>
+      </w:r>
+      <w:r>
+        <w:rPr>
+          <w:i/>
+          <w:iCs/>
+        </w:rPr>
+        <w:t xml:space="preserve">prompts</w:t>
+      </w:r>
+      <w:r>
+        <w:t xml:space="preserve"> </w:t>
+      </w:r>
+      <w:r>
+        <w:t xml:space="preserve">do DIN-SQL, os parâmetros de decodificação (</w:t>
       </w:r>
       <w:r>
         <w:rPr>
@@ -1866,7 +2055,39 @@
         <w:t xml:space="preserve">stop tokens</w:t>
       </w:r>
       <w:r>
-        <w:t xml:space="preserve">), o avaliador oficial (test-suite-sql-eval), o hardware (RTX 4090) e a infraestrutura de serving (vLLM em precisão FP16). Esse controle assegura que qualquer variação observada no EX possa ser atribuída ao fator efetivamente manipulado.</w:t>
+        <w:t xml:space="preserve">), o avaliador oficial (test-suite-sql-eval), o</w:t>
+      </w:r>
+      <w:r>
+        <w:t xml:space="preserve"> </w:t>
+      </w:r>
+      <w:r>
+        <w:rPr>
+          <w:i/>
+          <w:iCs/>
+        </w:rPr>
+        <w:t xml:space="preserve">hardware</w:t>
+      </w:r>
+      <w:r>
+        <w:t xml:space="preserve"> </w:t>
+      </w:r>
+      <w:r>
+        <w:t xml:space="preserve">(RTX 4090) e a infraestrutura de</w:t>
+      </w:r>
+      <w:r>
+        <w:t xml:space="preserve"> </w:t>
+      </w:r>
+      <w:r>
+        <w:rPr>
+          <w:i/>
+          <w:iCs/>
+        </w:rPr>
+        <w:t xml:space="preserve">serving</w:t>
+      </w:r>
+      <w:r>
+        <w:t xml:space="preserve"> </w:t>
+      </w:r>
+      <w:r>
+        <w:t xml:space="preserve">(vLLM em precisão FP16). Esse controle assegura que qualquer variação observada no EX possa ser atribuída ao fator efetivamente manipulado.</w:t>
       </w:r>
     </w:p>
     <w:bookmarkEnd w:id="18"/>
@@ -1894,7 +2115,7 @@
         <w:t xml:space="preserve"> </w:t>
       </w:r>
       <w:r>
-        <w:t xml:space="preserve">Em vez de avaliar todo o conjunto de desenvolvimento do Spider (1.034 consultas) — custoso quando multiplicado por cinco modelos e várias configurações —, construímos um subconjunto de 200 consultas por amostragem aleatória estratificada por dificuldade, com</w:t>
+        <w:t xml:space="preserve">Em vez de avaliar todo o conjunto de desenvolvimento do Spider (1.034 consultas) — opção onerosa quando multiplicada por cinco modelos e diversas configurações —, construímos um subconjunto de 200 consultas por amostragem aleatória estratificada por dificuldade, com</w:t>
       </w:r>
       <w:r>
         <w:t xml:space="preserve"> </w:t>
@@ -1995,7 +2216,23 @@
         <w:t xml:space="preserve">153d3fccf9a49ce6</w:t>
       </w:r>
       <w:r>
-        <w:t xml:space="preserve">) para garantir que qualquer reexecução opere exatamente sobre as mesmas instâncias. Vale notar que, por privilegiarmos um número razoável de exemplos difíceis, a proporção dos estratos do subset difere da do dev completo. É por isso que, ao confrontar nossos números com os do artigo original, fazemos a comparação por dificuldade, e não pelo agregado.</w:t>
+        <w:t xml:space="preserve">) para garantir que qualquer reexecução opere exatamente sobre as mesmas instâncias. Cabe observar que, por privilegiarmos um número razoável de exemplos difíceis, a proporção dos estratos do subconjunto difere da do</w:t>
+      </w:r>
+      <w:r>
+        <w:t xml:space="preserve"> </w:t>
+      </w:r>
+      <w:r>
+        <w:rPr>
+          <w:i/>
+          <w:iCs/>
+        </w:rPr>
+        <w:t xml:space="preserve">dev</w:t>
+      </w:r>
+      <w:r>
+        <w:t xml:space="preserve"> </w:t>
+      </w:r>
+      <w:r>
+        <w:t xml:space="preserve">completo. Por essa razão, ao confrontar nossos resultados com os do artigo original, realizamos a comparação por dificuldade, e não pelo agregado.</w:t>
       </w:r>
     </w:p>
     <w:p>
@@ -2013,7 +2250,7 @@
         <w:t xml:space="preserve"> </w:t>
       </w:r>
       <w:r>
-        <w:t xml:space="preserve">Como todas as configurações são avaliadas sobre exatamente as mesmas 200 consultas, dispomos de medidas pareadas no nível da instância: para cada consulta, sabemos se cada cenário acertou ou errou. Esse pareamento habilita o uso de testes como McNemar e Friedman, mais potentes do que suas contrapartes para amostras independentes, pois removem a variância atribuível à dificuldade intrínseca de cada consulta.</w:t>
+        <w:t xml:space="preserve">Como todas as configurações são avaliadas sobre exatamente as mesmas 200 consultas, dispomos de medidas pareadas no nível da instância: para cada consulta, sabemos se cada cenário acertou ou errou. Esse pareamento viabiliza o uso de testes como McNemar e Friedman, mais potentes do que suas contrapartes para amostras independentes, pois removem a variância atribuível à dificuldade intrínseca de cada consulta.</w:t>
       </w:r>
     </w:p>
     <w:p>
@@ -2031,7 +2268,23 @@
         <w:t xml:space="preserve"> </w:t>
       </w:r>
       <w:r>
-        <w:t xml:space="preserve">O número de repetições seguiu a natureza de cada cenário. Os cenários determinísticos — os cinco backbones e as configurações de ablação — usam decodificação</w:t>
+        <w:t xml:space="preserve">O número de repetições seguiu a natureza de cada cenário. Os cenários determinísticos — os cinco</w:t>
+      </w:r>
+      <w:r>
+        <w:t xml:space="preserve"> </w:t>
+      </w:r>
+      <w:r>
+        <w:rPr>
+          <w:i/>
+          <w:iCs/>
+        </w:rPr>
+        <w:t xml:space="preserve">backbones</w:t>
+      </w:r>
+      <w:r>
+        <w:t xml:space="preserve"> </w:t>
+      </w:r>
+      <w:r>
+        <w:t xml:space="preserve">e as configurações de ablação — empregam decodificação</w:t>
       </w:r>
       <w:r>
         <w:t xml:space="preserve"> </w:t>
@@ -2047,7 +2300,7 @@
         <w:t xml:space="preserve"> </w:t>
       </w:r>
       <w:r>
-        <w:t xml:space="preserve">(temperatura 0), cuja saída é, por construção, determinística; repetir uma execução nesse regime não acrescenta variância, de modo que adotamos N=1. Já o cenário estocástico de robustez, com temperatura maior que zero, exige estimar média e dispersão: para T=0,4 e T=0,8 realizamos N=5 repetições com sementes</w:t>
+        <w:t xml:space="preserve">(temperatura 0), cuja saída é, por construção, determinística; repetir uma execução nesse regime não acrescenta variância, de modo que adotamos N=1. Já o cenário estocástico de robustez, com temperatura superior a zero, exige estimar média e dispersão: para T=0,4 e T=0,8 realizamos N=5 repetições com sementes</w:t>
       </w:r>
       <w:r>
         <w:t xml:space="preserve"> </w:t>
@@ -2059,7 +2312,7 @@
         <w:t xml:space="preserve">seed=1..5</w:t>
       </w:r>
       <w:r>
-        <w:t xml:space="preserve">, conciliando reprodutibilidade com a amostragem da variabilidade introduzida na decodificação. Antes dos experimentos, validamos a infraestrutura: uma avaliação</w:t>
+        <w:t xml:space="preserve">, conciliando reprodutibilidade com a amostragem da variabilidade introduzida na decodificação. Previamente aos experimentos, validamos a infraestrutura: uma avaliação</w:t>
       </w:r>
       <w:r>
         <w:t xml:space="preserve"> </w:t>
@@ -2091,7 +2344,36 @@
         <w:t xml:space="preserve"> </w:t>
       </w:r>
       <w:r>
-        <w:t xml:space="preserve">do baseline reproduziu exatamente o EX=0,745, o que confirmou a estabilidade do pipeline.</w:t>
+        <w:t xml:space="preserve">do</w:t>
+      </w:r>
+      <w:r>
+        <w:t xml:space="preserve"> </w:t>
+      </w:r>
+      <w:r>
+        <w:rPr>
+          <w:i/>
+          <w:iCs/>
+        </w:rPr>
+        <w:t xml:space="preserve">baseline</w:t>
+      </w:r>
+      <w:r>
+        <w:t xml:space="preserve"> </w:t>
+      </w:r>
+      <w:r>
+        <w:t xml:space="preserve">reproduziu exatamente o EX=0,745, o que confirmou a estabilidade do</w:t>
+      </w:r>
+      <w:r>
+        <w:t xml:space="preserve"> </w:t>
+      </w:r>
+      <w:r>
+        <w:rPr>
+          <w:i/>
+          <w:iCs/>
+        </w:rPr>
+        <w:t xml:space="preserve">pipeline</w:t>
+      </w:r>
+      <w:r>
+        <w:t xml:space="preserve">.</w:t>
       </w:r>
     </w:p>
     <w:bookmarkEnd w:id="19"/>
@@ -2109,7 +2391,7 @@
         <w:pStyle w:val="FirstParagraph"/>
       </w:pPr>
       <w:r>
-        <w:t xml:space="preserve">Todos os modelos foram servidos localmente com vLLM, por meio de sua API compatível com OpenAI, em precisão FP16 e sobre uma única NVIDIA RTX 4090 (24 GB) — um ambiente acessível e de custo operacional nulo, em contraste com a dependência do GPT-4 no trabalho original. As predições foram avaliadas com o avaliador oficial test-suite-sql-eval do Spider, que computa EX e EM a partir das consultas geradas.</w:t>
+        <w:t xml:space="preserve">Todos os modelos foram servidos localmente com vLLM, por meio de sua API compatível com OpenAI, em precisão FP16 e sobre uma única NVIDIA RTX 4090 (24 GB) — ambiente acessível e de custo operacional nulo, em contraste com a dependência do GPT-4 no trabalho original. As predições foram avaliadas com o avaliador oficial test-suite-sql-eval do Spider, que computa EX e EM a partir das consultas geradas.</w:t>
       </w:r>
     </w:p>
     <w:p>
@@ -2117,7 +2399,23 @@
         <w:pStyle w:val="BodyText"/>
       </w:pPr>
       <w:r>
-        <w:t xml:space="preserve">O experimento é orquestrado por um conjunto de scripts versionados, executável de ponta a ponta: o preparo do ambiente e dos dados (</w:t>
+        <w:t xml:space="preserve">O experimento é orquestrado por um conjunto de</w:t>
+      </w:r>
+      <w:r>
+        <w:t xml:space="preserve"> </w:t>
+      </w:r>
+      <w:r>
+        <w:rPr>
+          <w:i/>
+          <w:iCs/>
+        </w:rPr>
+        <w:t xml:space="preserve">scripts</w:t>
+      </w:r>
+      <w:r>
+        <w:t xml:space="preserve"> </w:t>
+      </w:r>
+      <w:r>
+        <w:t xml:space="preserve">versionados, executável de ponta a ponta: o preparo do ambiente e dos dados (</w:t>
       </w:r>
       <w:r>
         <w:rPr>
@@ -2150,7 +2448,7 @@
         <w:t xml:space="preserve">download_models.sh</w:t>
       </w:r>
       <w:r>
-        <w:t xml:space="preserve">), a construção do subset determinístico (</w:t>
+        <w:t xml:space="preserve">), a construção do subconjunto determinístico (</w:t>
       </w:r>
       <w:r>
         <w:rPr>
@@ -2225,7 +2523,7 @@
         <w:t xml:space="preserve">make_figures.py</w:t>
       </w:r>
       <w:r>
-        <w:t xml:space="preserve">). Desses artefatos resultam as Figuras 1 a 7 — da Figura 1, com o EX agregado e seus intervalos de confiança, até a Figura 7, que confronta diretamente o Qwen com o GPT-4 por dificuldade.</w:t>
+        <w:t xml:space="preserve">). Desses artefatos resultam as Figuras 1 a 7 — da Figura 1, com o EX agregado e seus intervalos de confiança, à Figura 7, que confronta diretamente o Qwen com o GPT-4 por dificuldade.</w:t>
       </w:r>
     </w:p>
     <w:bookmarkEnd w:id="20"/>
@@ -2256,7 +2554,52 @@
         <w:t xml:space="preserve">o EX de uma consulta é uma variável binária (Bernoulli)</w:t>
       </w:r>
       <w:r>
-        <w:t xml:space="preserve">: cada instância é acerto ou erro. A suposição de normalidade, portanto, simplesmente não se aplica às comparações principais entre cenários, e por isso recorremos a testes não-paramétricos pareados, adequados a dados de acerto/erro emparelhados. Para as comparações par a par — tanto na ablação quanto entre pares de backbones — empregamos o teste de McNemar, que analisa as discordâncias entre dois cenários sobre as mesmas consultas. Para a comparação simultânea dos cinco backbones, usamos o teste de Friedman, seguido, quando indicado, de um post-hoc de McNemar com correção de Bonferroni-Holm para controlar a taxa de erro sob múltiplas comparações. Como o p-valor isolado não comunica magnitude, reportamos o tamanho de efeito pelo</w:t>
+        <w:t xml:space="preserve">: cada instância é acerto ou erro. A suposição de normalidade, portanto, não se aplica às comparações principais entre cenários, razão pela qual recorremos a testes não-paramétricos pareados, adequados a dados de acerto/erro emparelhados. Para as comparações par a par — tanto na ablação quanto entre pares de</w:t>
+      </w:r>
+      <w:r>
+        <w:t xml:space="preserve"> </w:t>
+      </w:r>
+      <w:r>
+        <w:rPr>
+          <w:i/>
+          <w:iCs/>
+        </w:rPr>
+        <w:t xml:space="preserve">backbones</w:t>
+      </w:r>
+      <w:r>
+        <w:t xml:space="preserve"> </w:t>
+      </w:r>
+      <w:r>
+        <w:t xml:space="preserve">— empregamos o teste de McNemar, que analisa as discordâncias entre dois cenários sobre as mesmas consultas. Para a comparação simultânea dos cinco</w:t>
+      </w:r>
+      <w:r>
+        <w:t xml:space="preserve"> </w:t>
+      </w:r>
+      <w:r>
+        <w:rPr>
+          <w:i/>
+          <w:iCs/>
+        </w:rPr>
+        <w:t xml:space="preserve">backbones</w:t>
+      </w:r>
+      <w:r>
+        <w:t xml:space="preserve">, utilizamos o teste de Friedman, seguido, quando indicado, de um</w:t>
+      </w:r>
+      <w:r>
+        <w:t xml:space="preserve"> </w:t>
+      </w:r>
+      <w:r>
+        <w:rPr>
+          <w:i/>
+          <w:iCs/>
+        </w:rPr>
+        <w:t xml:space="preserve">post-hoc</w:t>
+      </w:r>
+      <w:r>
+        <w:t xml:space="preserve"> </w:t>
+      </w:r>
+      <w:r>
+        <w:t xml:space="preserve">de McNemar com correção de Bonferroni-Holm para controlar a taxa de erro sob múltiplas comparações. Como o p-valor isolado não comunica magnitude, reportamos o tamanho de efeito pelo</w:t>
       </w:r>
       <w:r>
         <w:t xml:space="preserve"> </w:t>
@@ -2280,7 +2623,36 @@
         <w:pStyle w:val="BodyText"/>
       </w:pPr>
       <w:r>
-        <w:t xml:space="preserve">A incerteza de cada estimativa de EX foi quantificada por intervalos de confiança de 95% via bootstrap (1.000 reamostragens), o que nos permite julgar H1 de modo formal: basta verificar se o intervalo do Qwen contém o valor de referência do paper. A verificação de normalidade por Shapiro-Wilk ficou reservada ao único ponto em que faz sentido — as amostras contínuas de EX médio entre as cinco repetições do experimento de robustez. Como essas amostras se mostraram compatíveis com a normalidade (Shapiro p=0,236 em T=0,4 e p=0,435 em T=0,8), prosseguimos com o teste de Levene para a homogeneidade de variância entre temperaturas e, para o efeito sobre a média, com Kruskal-Wallis (complementado por Mann-Whitney), mantendo a abordagem não-paramétrica como salvaguarda diante do tamanho amostral reduzido (N=5). As análises foram implementadas com</w:t>
+        <w:t xml:space="preserve">A incerteza de cada estimativa de EX foi quantificada por intervalos de confiança de 95% via</w:t>
+      </w:r>
+      <w:r>
+        <w:t xml:space="preserve"> </w:t>
+      </w:r>
+      <w:r>
+        <w:rPr>
+          <w:i/>
+          <w:iCs/>
+        </w:rPr>
+        <w:t xml:space="preserve">bootstrap</w:t>
+      </w:r>
+      <w:r>
+        <w:t xml:space="preserve"> </w:t>
+      </w:r>
+      <w:r>
+        <w:t xml:space="preserve">(1.000 reamostragens), o que nos permite avaliar H1 de modo formal: basta verificar se o intervalo do Qwen contém o valor de referência do</w:t>
+      </w:r>
+      <w:r>
+        <w:t xml:space="preserve"> </w:t>
+      </w:r>
+      <w:r>
+        <w:rPr>
+          <w:i/>
+          <w:iCs/>
+        </w:rPr>
+        <w:t xml:space="preserve">paper</w:t>
+      </w:r>
+      <w:r>
+        <w:t xml:space="preserve">. A verificação de normalidade por Shapiro-Wilk ficou restrita ao único ponto em que é pertinente — as amostras contínuas de EX médio entre as cinco repetições do experimento de robustez. Como essas amostras se mostraram compatíveis com a normalidade (Shapiro p=0,236 em T=0,4 e p=0,435 em T=0,8), prosseguimos com o teste de Levene para a homogeneidade de variância entre temperaturas e, para o efeito sobre a média, com Kruskal-Wallis (complementado por Mann-Whitney), mantendo a abordagem não-paramétrica como salvaguarda diante do tamanho amostral reduzido (N=5). As análises foram implementadas com</w:t>
       </w:r>
       <w:r>
         <w:t xml:space="preserve"> </w:t>
@@ -2332,6 +2704,18 @@
       </w:r>
       <w:r>
         <w:t xml:space="preserve">. Em síntese, o desenho é controlado, pareado e reprodutível, e cada inferência repousa sobre um teste apropriado ao tipo de dado que a sustenta.</w:t>
+      </w:r>
+    </w:p>
+    <w:p>
+      <w:pPr>
+        <w:pStyle w:val="BodyText"/>
+      </w:pPr>
+      <w:r>
+        <w:rPr>
+          <w:b/>
+          <w:bCs/>
+        </w:rPr>
+        <w:t xml:space="preserve">Verification of numbers:</w:t>
       </w:r>
     </w:p>
     <w:bookmarkEnd w:id="21"/>
@@ -2350,7 +2734,39 @@
         <w:pStyle w:val="FirstParagraph"/>
       </w:pPr>
       <w:r>
-        <w:t xml:space="preserve">Apresentamos nesta seção os achados de forma estritamente descritiva, organizados em torno das quatro hipóteses do estudo; a interpretação aprofundada e os vereditos das hipóteses ficam reservados para a Discussão. Salvo indicação em contrário, todos os números reportam Execution Accuracy (EX) e Exact-Set-Match (EM) sobre o subset estratificado de 200 queries do Spider dev (easy 70, medium 70, hard 35, extra 25;</w:t>
+        <w:t xml:space="preserve">Apresentamos nesta seção os achados de forma estritamente descritiva, organizados em torno das quatro hipóteses do estudo; a interpretação aprofundada e os vereditos das hipóteses ficam reservados para a Discussão. Salvo indicação em contrário, todos os valores reportam</w:t>
+      </w:r>
+      <w:r>
+        <w:t xml:space="preserve"> </w:t>
+      </w:r>
+      <w:r>
+        <w:rPr>
+          <w:i/>
+          <w:iCs/>
+        </w:rPr>
+        <w:t xml:space="preserve">Execution Accuracy</w:t>
+      </w:r>
+      <w:r>
+        <w:t xml:space="preserve"> </w:t>
+      </w:r>
+      <w:r>
+        <w:t xml:space="preserve">(EX) e</w:t>
+      </w:r>
+      <w:r>
+        <w:t xml:space="preserve"> </w:t>
+      </w:r>
+      <w:r>
+        <w:rPr>
+          <w:i/>
+          <w:iCs/>
+        </w:rPr>
+        <w:t xml:space="preserve">Exact-Set-Match</w:t>
+      </w:r>
+      <w:r>
+        <w:t xml:space="preserve"> </w:t>
+      </w:r>
+      <w:r>
+        <w:t xml:space="preserve">(EM) sobre o subset estratificado de 200 consultas do Spider dev (easy 70, medium 70, hard 35, extra 25;</w:t>
       </w:r>
       <w:r>
         <w:t xml:space="preserve"> </w:t>
@@ -2402,7 +2818,23 @@
         <w:t xml:space="preserve"> </w:t>
       </w:r>
       <w:r>
-        <w:t xml:space="preserve">retornou EX=EM=1,000 e o run greedy reproduziu exatamente o baseline (EX=0,745), o que confirma a reprodutibilidade do pipeline.</w:t>
+        <w:t xml:space="preserve">retornou EX=EM=1,000 e o</w:t>
+      </w:r>
+      <w:r>
+        <w:t xml:space="preserve"> </w:t>
+      </w:r>
+      <w:r>
+        <w:rPr>
+          <w:i/>
+          <w:iCs/>
+        </w:rPr>
+        <w:t xml:space="preserve">run</w:t>
+      </w:r>
+      <w:r>
+        <w:t xml:space="preserve"> </w:t>
+      </w:r>
+      <w:r>
+        <w:t xml:space="preserve">greedy reproduziu exatamente o baseline (EX=0,745), o que confirma a reprodutibilidade do pipeline.</w:t>
       </w:r>
     </w:p>
     <w:bookmarkStart w:id="35" w:name="X1f8e3aeb93456815a884e73fe27dfea6a080da2"/>
@@ -2435,7 +2867,7 @@
         <w:t xml:space="preserve"> </w:t>
       </w:r>
       <w:r>
-        <w:t xml:space="preserve">de cinco provedores distintos sob o mesmo pipeline DIN-SQL. A Tabela 1 resume o EX e o EM agregados, bem como o EX desagregado por estrato de dificuldade.</w:t>
+        <w:t xml:space="preserve">de cinco provedores distintos sob o mesmo pipeline DIN-SQL. A Tabela 1 sintetiza o EX e o EM agregados, bem como o EX desagregado por estrato de dificuldade.</w:t>
       </w:r>
     </w:p>
     <w:p>
@@ -2461,6 +2893,14 @@
         <w:tblStyle w:val="Table"/>
         <w:tblW w:type="auto" w:w="0"/>
         <w:tblLook w:firstRow="1" w:lastRow="0" w:firstColumn="0" w:lastColumn="0" w:noHBand="0" w:noVBand="0" w:val="0020"/>
+        <w:tblBorders>
+          <w:top w:val="single" w:sz="4" w:space="0" w:color="auto"/>
+          <w:left w:val="single" w:sz="4" w:space="0" w:color="auto"/>
+          <w:bottom w:val="single" w:sz="4" w:space="0" w:color="auto"/>
+          <w:right w:val="single" w:sz="4" w:space="0" w:color="auto"/>
+          <w:insideH w:val="single" w:sz="4" w:space="0" w:color="auto"/>
+          <w:insideV w:val="single" w:sz="4" w:space="0" w:color="auto"/>
+        </w:tblBorders>
       </w:tblPr>
       <w:tblGrid>
         <w:gridCol w:w="1131"/>
@@ -2476,78 +2916,113 @@
           <w:tblHeader w:val="on"/>
         </w:trPr>
         <w:tc>
-          <w:tcPr/>
-          <w:p>
-            <w:pPr>
-              <w:pStyle w:val="Compact"/>
-            </w:pPr>
-            <w:r>
+          <w:tcPr>
+            <w:shd w:val="clear" w:color="auto" w:fill="D9E1F2"/>
+          </w:tcPr>
+          <w:p>
+            <w:pPr>
+              <w:pStyle w:val="Compact"/>
+            </w:pPr>
+            <w:r>
+              <w:rPr>
+                <w:b/>
+              </w:rPr>
               <w:t xml:space="preserve">Modelo (provedor)</w:t>
             </w:r>
           </w:p>
         </w:tc>
         <w:tc>
-          <w:tcPr/>
-          <w:p>
-            <w:pPr>
-              <w:pStyle w:val="Compact"/>
-            </w:pPr>
-            <w:r>
+          <w:tcPr>
+            <w:shd w:val="clear" w:color="auto" w:fill="D9E1F2"/>
+          </w:tcPr>
+          <w:p>
+            <w:pPr>
+              <w:pStyle w:val="Compact"/>
+            </w:pPr>
+            <w:r>
+              <w:rPr>
+                <w:b/>
+              </w:rPr>
               <w:t xml:space="preserve">EX all</w:t>
             </w:r>
           </w:p>
         </w:tc>
         <w:tc>
-          <w:tcPr/>
-          <w:p>
-            <w:pPr>
-              <w:pStyle w:val="Compact"/>
-            </w:pPr>
-            <w:r>
+          <w:tcPr>
+            <w:shd w:val="clear" w:color="auto" w:fill="D9E1F2"/>
+          </w:tcPr>
+          <w:p>
+            <w:pPr>
+              <w:pStyle w:val="Compact"/>
+            </w:pPr>
+            <w:r>
+              <w:rPr>
+                <w:b/>
+              </w:rPr>
               <w:t xml:space="preserve">EM all</w:t>
             </w:r>
           </w:p>
         </w:tc>
         <w:tc>
-          <w:tcPr/>
-          <w:p>
-            <w:pPr>
-              <w:pStyle w:val="Compact"/>
-            </w:pPr>
-            <w:r>
+          <w:tcPr>
+            <w:shd w:val="clear" w:color="auto" w:fill="D9E1F2"/>
+          </w:tcPr>
+          <w:p>
+            <w:pPr>
+              <w:pStyle w:val="Compact"/>
+            </w:pPr>
+            <w:r>
+              <w:rPr>
+                <w:b/>
+              </w:rPr>
               <w:t xml:space="preserve">easy</w:t>
             </w:r>
           </w:p>
         </w:tc>
         <w:tc>
-          <w:tcPr/>
-          <w:p>
-            <w:pPr>
-              <w:pStyle w:val="Compact"/>
-            </w:pPr>
-            <w:r>
+          <w:tcPr>
+            <w:shd w:val="clear" w:color="auto" w:fill="D9E1F2"/>
+          </w:tcPr>
+          <w:p>
+            <w:pPr>
+              <w:pStyle w:val="Compact"/>
+            </w:pPr>
+            <w:r>
+              <w:rPr>
+                <w:b/>
+              </w:rPr>
               <w:t xml:space="preserve">medium</w:t>
             </w:r>
           </w:p>
         </w:tc>
         <w:tc>
-          <w:tcPr/>
-          <w:p>
-            <w:pPr>
-              <w:pStyle w:val="Compact"/>
-            </w:pPr>
-            <w:r>
+          <w:tcPr>
+            <w:shd w:val="clear" w:color="auto" w:fill="D9E1F2"/>
+          </w:tcPr>
+          <w:p>
+            <w:pPr>
+              <w:pStyle w:val="Compact"/>
+            </w:pPr>
+            <w:r>
+              <w:rPr>
+                <w:b/>
+              </w:rPr>
               <w:t xml:space="preserve">hard</w:t>
             </w:r>
           </w:p>
         </w:tc>
         <w:tc>
-          <w:tcPr/>
-          <w:p>
-            <w:pPr>
-              <w:pStyle w:val="Compact"/>
-            </w:pPr>
-            <w:r>
+          <w:tcPr>
+            <w:shd w:val="clear" w:color="auto" w:fill="D9E1F2"/>
+          </w:tcPr>
+          <w:p>
+            <w:pPr>
+              <w:pStyle w:val="Compact"/>
+            </w:pPr>
+            <w:r>
+              <w:rPr>
+                <w:b/>
+              </w:rPr>
               <w:t xml:space="preserve">extra</w:t>
             </w:r>
           </w:p>
@@ -3065,7 +3540,7 @@
         <w:pStyle w:val="BodyText"/>
       </w:pPr>
       <w:r>
-        <w:t xml:space="preserve">O melhor backbone aberto, o Qwen2.5-Coder-7B, atingiu EX=0,745, valor praticamente idêntico ao 0,742 que o DIN-SQL alcança com GPT-4. O intervalo de confiança bootstrap de 95% para esse EX é [0,680, 0,805] e contém o valor de referência do paper. Os demais coders de 7-9B ficaram pouco abaixo — DeepSeek-Coder-6.7B em [0,665, 0,790] e Yi-Coder-9B em [0,660, 0,790] —, enquanto Granite-8B [0,605, 0,740] e Phi-3.5-mini [0,560, 0,695] ocuparam a faixa inferior. A Figura 1 dispõe esses cinco valores de EX com seus IC95% e a linha horizontal do GPT-4 do paper, deixando visível a ampla sobreposição dos intervalos dos três coders maiores.</w:t>
+        <w:t xml:space="preserve">O melhor backbone aberto, o Qwen2.5-Coder-7B, atingiu EX=0,745, valor praticamente idêntico ao 0,742 obtido pelo DIN-SQL com GPT-4. O intervalo de confiança bootstrap de 95% para esse EX é [0,680, 0,805] e contém o valor de referência do paper. Os demais coders de 7-9B situaram-se ligeiramente abaixo — DeepSeek-Coder-6.7B em [0,665, 0,790] e Yi-Coder-9B em [0,660, 0,790] —, ao passo que Granite-8B [0,605, 0,740] e Phi-3.5-mini [0,560, 0,695] ocuparam a faixa inferior. A Figura 1 dispõe esses cinco valores de EX com seus IC95% e a linha horizontal correspondente ao GPT-4 do paper, evidenciando a ampla sobreposição dos intervalos dos três coders maiores.</w:t>
       </w:r>
     </w:p>
     <w:p>
@@ -3138,7 +3613,7 @@
         <w:pStyle w:val="BodyText"/>
       </w:pPr>
       <w:r>
-        <w:t xml:space="preserve">Quando decompomos o desempenho por dificuldade (Figura 2), surge um padrão claro: o Qwen fica abaixo do GPT-4 nos estratos easy (0,814 contra 0,911) e medium (0,729 contra 0,798), mas alcança ou supera a referência justamente nos estratos mais difíceis — hard (0,686 contra 0,649) e extra (0,680 contra 0,434). A Figura 7 detalha esse confronto direto, estrato a estrato, entre o Qwen local e o GPT-4 do paper. No extremo oposto situa-se o Phi-3.5-mini, cujo EX no estrato hard desaba para 0,400.</w:t>
+        <w:t xml:space="preserve">A decomposição do desempenho por dificuldade (Figura 2) revela um padrão consistente: o Qwen fica abaixo do GPT-4 nos estratos easy (0,814 contra 0,911) e medium (0,729 contra 0,798), mas iguala ou supera a referência precisamente nos estratos mais difíceis — hard (0,686 contra 0,649) e extra (0,680 contra 0,434). A Figura 7 detalha esse confronto direto, estrato a estrato, entre o Qwen local e o GPT-4 do paper. No extremo oposto situa-se o Phi-3.5-mini, cujo EX no estrato hard reduz-se a 0,400.</w:t>
       </w:r>
     </w:p>
     <w:p>
@@ -3211,7 +3686,7 @@
         <w:pStyle w:val="BodyText"/>
       </w:pPr>
       <w:r>
-        <w:t xml:space="preserve">Observamos ainda uma diferença consistente entre EX e EM em todos os backbones (Figura 3): o gap (EX menos EM) foi de 0,125 no Qwen, 0,185 no Yi, 0,210 no Granite, 0,275 no Phi e 0,280 no DeepSeek. Note-se que o melhor modelo é também o de menor gap, ao passo que DeepSeek e Phi acumulam as maiores distâncias entre acerto de execução e correspondência exata.</w:t>
+        <w:t xml:space="preserve">Observamos ainda uma diferença sistemática entre EX e EM em todos os backbones (Figura 3): o gap (EX menos EM) foi de 0,125 no Qwen, 0,185 no Yi, 0,210 no Granite, 0,275 no Phi e 0,280 no DeepSeek. Note-se que o modelo de melhor desempenho é também o de menor gap, enquanto DeepSeek e Phi acumulam as maiores distâncias entre acerto de execução e correspondência exata.</w:t>
       </w:r>
     </w:p>
     <w:p>
@@ -3284,7 +3759,7 @@
         <w:pStyle w:val="BodyText"/>
       </w:pPr>
       <w:r>
-        <w:t xml:space="preserve">Quanto à hipótese H3, o teste de Friedman sobre a matriz por-query indicou diferença global significativa entre os cinco backbones (χ²=14,379; p=0,0062). No post-hoc, as comparações pareadas de McNemar com correção de Bonferroni-Holm revelaram um único par significativo: Qwen2.5-Coder-7B contra Phi-3.5-mini (p=0,001; p_aj=0,013; Cohen h=+0,249). Os contrastes entre os coders maiores não atingiram significância — Qwen vs DeepSeek p=0,890 e Qwen vs Yi p=0,665 —, e Qwen vs Granite ficou exatamente no limiar (p=0,050), mas não sobreviveu à correção de Holm. Em suma, a diferença global é puxada pelo Phi-3.5; os coders de 7-9B empatam entre si.</w:t>
+        <w:t xml:space="preserve">Quanto à hipótese H3, o teste de Friedman sobre a matriz por-query indicou diferença global significativa entre os cinco backbones (χ²=14,379; p=0,0062). No post-hoc, as comparações pareadas de McNemar com correção de Bonferroni-Holm revelaram um único par significativo: Qwen2.5-Coder-7B contra Phi-3.5-mini (p=0,001; p_aj=0,013; Cohen h=+0,249). Os contrastes entre os coders maiores não atingiram significância — Qwen vs DeepSeek p=0,890 e Qwen vs Yi p=0,665 —, e Qwen vs Granite ficou exatamente no limiar (p=0,050), sem sobreviver à correção de Holm. Em síntese, a diferença global é determinada pelo Phi-3.5, enquanto os coders de 7-9B são estatisticamente indistinguíveis entre si.</w:t>
       </w:r>
     </w:p>
     <w:p>
@@ -3393,6 +3868,14 @@
         <w:tblStyle w:val="Table"/>
         <w:tblW w:type="auto" w:w="0"/>
         <w:tblLook w:firstRow="1" w:lastRow="0" w:firstColumn="0" w:lastColumn="0" w:noHBand="0" w:noVBand="0" w:val="0020"/>
+        <w:tblBorders>
+          <w:top w:val="single" w:sz="4" w:space="0" w:color="auto"/>
+          <w:left w:val="single" w:sz="4" w:space="0" w:color="auto"/>
+          <w:bottom w:val="single" w:sz="4" w:space="0" w:color="auto"/>
+          <w:right w:val="single" w:sz="4" w:space="0" w:color="auto"/>
+          <w:insideH w:val="single" w:sz="4" w:space="0" w:color="auto"/>
+          <w:insideV w:val="single" w:sz="4" w:space="0" w:color="auto"/>
+        </w:tblBorders>
       </w:tblPr>
       <w:tblGrid>
         <w:gridCol w:w="880"/>
@@ -3410,100 +3893,145 @@
           <w:tblHeader w:val="on"/>
         </w:trPr>
         <w:tc>
-          <w:tcPr/>
-          <w:p>
-            <w:pPr>
-              <w:pStyle w:val="Compact"/>
-            </w:pPr>
-            <w:r>
+          <w:tcPr>
+            <w:shd w:val="clear" w:color="auto" w:fill="D9E1F2"/>
+          </w:tcPr>
+          <w:p>
+            <w:pPr>
+              <w:pStyle w:val="Compact"/>
+            </w:pPr>
+            <w:r>
+              <w:rPr>
+                <w:b/>
+              </w:rPr>
               <w:t xml:space="preserve">Configuração</w:t>
             </w:r>
           </w:p>
         </w:tc>
         <w:tc>
-          <w:tcPr/>
-          <w:p>
-            <w:pPr>
-              <w:pStyle w:val="Compact"/>
-            </w:pPr>
-            <w:r>
+          <w:tcPr>
+            <w:shd w:val="clear" w:color="auto" w:fill="D9E1F2"/>
+          </w:tcPr>
+          <w:p>
+            <w:pPr>
+              <w:pStyle w:val="Compact"/>
+            </w:pPr>
+            <w:r>
+              <w:rPr>
+                <w:b/>
+              </w:rPr>
               <w:t xml:space="preserve">EX all</w:t>
             </w:r>
           </w:p>
         </w:tc>
         <w:tc>
-          <w:tcPr/>
-          <w:p>
-            <w:pPr>
-              <w:pStyle w:val="Compact"/>
-            </w:pPr>
-            <w:r>
+          <w:tcPr>
+            <w:shd w:val="clear" w:color="auto" w:fill="D9E1F2"/>
+          </w:tcPr>
+          <w:p>
+            <w:pPr>
+              <w:pStyle w:val="Compact"/>
+            </w:pPr>
+            <w:r>
+              <w:rPr>
+                <w:b/>
+              </w:rPr>
               <w:t xml:space="preserve">easy</w:t>
             </w:r>
           </w:p>
         </w:tc>
         <w:tc>
-          <w:tcPr/>
-          <w:p>
-            <w:pPr>
-              <w:pStyle w:val="Compact"/>
-            </w:pPr>
-            <w:r>
+          <w:tcPr>
+            <w:shd w:val="clear" w:color="auto" w:fill="D9E1F2"/>
+          </w:tcPr>
+          <w:p>
+            <w:pPr>
+              <w:pStyle w:val="Compact"/>
+            </w:pPr>
+            <w:r>
+              <w:rPr>
+                <w:b/>
+              </w:rPr>
               <w:t xml:space="preserve">medium</w:t>
             </w:r>
           </w:p>
         </w:tc>
         <w:tc>
-          <w:tcPr/>
-          <w:p>
-            <w:pPr>
-              <w:pStyle w:val="Compact"/>
-            </w:pPr>
-            <w:r>
+          <w:tcPr>
+            <w:shd w:val="clear" w:color="auto" w:fill="D9E1F2"/>
+          </w:tcPr>
+          <w:p>
+            <w:pPr>
+              <w:pStyle w:val="Compact"/>
+            </w:pPr>
+            <w:r>
+              <w:rPr>
+                <w:b/>
+              </w:rPr>
               <w:t xml:space="preserve">hard</w:t>
             </w:r>
           </w:p>
         </w:tc>
         <w:tc>
-          <w:tcPr/>
-          <w:p>
-            <w:pPr>
-              <w:pStyle w:val="Compact"/>
-            </w:pPr>
-            <w:r>
+          <w:tcPr>
+            <w:shd w:val="clear" w:color="auto" w:fill="D9E1F2"/>
+          </w:tcPr>
+          <w:p>
+            <w:pPr>
+              <w:pStyle w:val="Compact"/>
+            </w:pPr>
+            <w:r>
+              <w:rPr>
+                <w:b/>
+              </w:rPr>
               <w:t xml:space="preserve">extra</w:t>
             </w:r>
           </w:p>
         </w:tc>
         <w:tc>
-          <w:tcPr/>
-          <w:p>
-            <w:pPr>
-              <w:pStyle w:val="Compact"/>
-            </w:pPr>
-            <w:r>
+          <w:tcPr>
+            <w:shd w:val="clear" w:color="auto" w:fill="D9E1F2"/>
+          </w:tcPr>
+          <w:p>
+            <w:pPr>
+              <w:pStyle w:val="Compact"/>
+            </w:pPr>
+            <w:r>
+              <w:rPr>
+                <w:b/>
+              </w:rPr>
               <w:t xml:space="preserve">Δ EX</w:t>
             </w:r>
           </w:p>
         </w:tc>
         <w:tc>
-          <w:tcPr/>
-          <w:p>
-            <w:pPr>
-              <w:pStyle w:val="Compact"/>
-            </w:pPr>
-            <w:r>
+          <w:tcPr>
+            <w:shd w:val="clear" w:color="auto" w:fill="D9E1F2"/>
+          </w:tcPr>
+          <w:p>
+            <w:pPr>
+              <w:pStyle w:val="Compact"/>
+            </w:pPr>
+            <w:r>
+              <w:rPr>
+                <w:b/>
+              </w:rPr>
               <w:t xml:space="preserve">p (McNemar)</w:t>
             </w:r>
           </w:p>
         </w:tc>
         <w:tc>
-          <w:tcPr/>
-          <w:p>
-            <w:pPr>
-              <w:pStyle w:val="Compact"/>
-            </w:pPr>
-            <w:r>
+          <w:tcPr>
+            <w:shd w:val="clear" w:color="auto" w:fill="D9E1F2"/>
+          </w:tcPr>
+          <w:p>
+            <w:pPr>
+              <w:pStyle w:val="Compact"/>
+            </w:pPr>
+            <w:r>
+              <w:rPr>
+                <w:b/>
+              </w:rPr>
               <w:t xml:space="preserve">Cohen h</w:t>
             </w:r>
           </w:p>
@@ -4020,7 +4548,7 @@
         <w:pStyle w:val="BodyText"/>
       </w:pPr>
       <w:r>
-        <w:t xml:space="preserve">A remoção do self-correction produziu a maior queda (−0,080), estatisticamente significativa (p&lt;0,001; h=−0,176), com colapso acentuado nos estratos hard (0,543) e extra (0,400). Forçar a geração via CoT decomposto em todas as queries também reduziu o EX de forma significativa (−0,070; p=0,026; h=−0,155), novamente com forte impacto no hard (0,457). Em sentido oposto, forçar o caminho few-shot simples elevou o EX para 0,790 (+0,045), efeito significativo ainda que limítrofe (p=0,049; h=+0,107), com ganhos em easy, medium e hard e perda isolada apenas no extra (0,560 contra 0,680). Por fim, remover o schema-linking deslocou o EX em apenas +0,020, variação que não atingiu significância (p=0,556; h=+0,049). A Figura 4 ilustra o EX agregado das cinco configurações com seus respectivos deltas, enquanto a Figura 5 detalha o comportamento de cada variante por dificuldade.</w:t>
+        <w:t xml:space="preserve">A remoção do self-correction produziu a maior queda (−0,080), estatisticamente significativa (p&lt;0,001; h=−0,176), com deterioração acentuada nos estratos hard (0,543) e extra (0,400). Forçar a geração via CoT decomposto em todas as queries também reduziu o EX de forma significativa (−0,070; p=0,026; h=−0,155), novamente com forte impacto no estrato hard (0,457). Em sentido oposto, forçar o caminho few-shot simples elevou o EX para 0,790 (+0,045), efeito significativo ainda que limítrofe (p=0,049; h=+0,107), com ganhos em easy, medium e hard e perda restrita apenas ao extra (0,560 contra 0,680). Por fim, a remoção do schema-linking deslocou o EX em apenas +0,020, variação que não atingiu significância (p=0,556; h=+0,049). A Figura 4 ilustra o EX agregado das cinco configurações com seus respectivos deltas, enquanto a Figura 5 detalha o comportamento de cada variante por dificuldade.</w:t>
       </w:r>
     </w:p>
     <w:p>
@@ -4203,6 +4731,14 @@
         <w:tblStyle w:val="Table"/>
         <w:tblW w:type="auto" w:w="0"/>
         <w:tblLook w:firstRow="1" w:lastRow="0" w:firstColumn="0" w:lastColumn="0" w:noHBand="0" w:noVBand="0" w:val="0020"/>
+        <w:tblBorders>
+          <w:top w:val="single" w:sz="4" w:space="0" w:color="auto"/>
+          <w:left w:val="single" w:sz="4" w:space="0" w:color="auto"/>
+          <w:bottom w:val="single" w:sz="4" w:space="0" w:color="auto"/>
+          <w:right w:val="single" w:sz="4" w:space="0" w:color="auto"/>
+          <w:insideH w:val="single" w:sz="4" w:space="0" w:color="auto"/>
+          <w:insideV w:val="single" w:sz="4" w:space="0" w:color="auto"/>
+        </w:tblBorders>
       </w:tblPr>
       <w:tblGrid>
         <w:gridCol w:w="1584"/>
@@ -4216,56 +4752,81 @@
           <w:tblHeader w:val="on"/>
         </w:trPr>
         <w:tc>
-          <w:tcPr/>
-          <w:p>
-            <w:pPr>
-              <w:pStyle w:val="Compact"/>
-            </w:pPr>
-            <w:r>
+          <w:tcPr>
+            <w:shd w:val="clear" w:color="auto" w:fill="D9E1F2"/>
+          </w:tcPr>
+          <w:p>
+            <w:pPr>
+              <w:pStyle w:val="Compact"/>
+            </w:pPr>
+            <w:r>
+              <w:rPr>
+                <w:b/>
+              </w:rPr>
               <w:t xml:space="preserve">Temperatura</w:t>
             </w:r>
           </w:p>
         </w:tc>
         <w:tc>
-          <w:tcPr/>
-          <w:p>
-            <w:pPr>
-              <w:pStyle w:val="Compact"/>
-            </w:pPr>
-            <w:r>
+          <w:tcPr>
+            <w:shd w:val="clear" w:color="auto" w:fill="D9E1F2"/>
+          </w:tcPr>
+          <w:p>
+            <w:pPr>
+              <w:pStyle w:val="Compact"/>
+            </w:pPr>
+            <w:r>
+              <w:rPr>
+                <w:b/>
+              </w:rPr>
               <w:t xml:space="preserve">EX médio</w:t>
             </w:r>
           </w:p>
         </w:tc>
         <w:tc>
-          <w:tcPr/>
-          <w:p>
-            <w:pPr>
-              <w:pStyle w:val="Compact"/>
-            </w:pPr>
-            <w:r>
+          <w:tcPr>
+            <w:shd w:val="clear" w:color="auto" w:fill="D9E1F2"/>
+          </w:tcPr>
+          <w:p>
+            <w:pPr>
+              <w:pStyle w:val="Compact"/>
+            </w:pPr>
+            <w:r>
+              <w:rPr>
+                <w:b/>
+              </w:rPr>
               <w:t xml:space="preserve">desvio (±)</w:t>
             </w:r>
           </w:p>
         </w:tc>
         <w:tc>
-          <w:tcPr/>
-          <w:p>
-            <w:pPr>
-              <w:pStyle w:val="Compact"/>
-            </w:pPr>
-            <w:r>
+          <w:tcPr>
+            <w:shd w:val="clear" w:color="auto" w:fill="D9E1F2"/>
+          </w:tcPr>
+          <w:p>
+            <w:pPr>
+              <w:pStyle w:val="Compact"/>
+            </w:pPr>
+            <w:r>
+              <w:rPr>
+                <w:b/>
+              </w:rPr>
               <w:t xml:space="preserve">reps</w:t>
             </w:r>
           </w:p>
         </w:tc>
         <w:tc>
-          <w:tcPr/>
-          <w:p>
-            <w:pPr>
-              <w:pStyle w:val="Compact"/>
-            </w:pPr>
-            <w:r>
+          <w:tcPr>
+            <w:shd w:val="clear" w:color="auto" w:fill="D9E1F2"/>
+          </w:tcPr>
+          <w:p>
+            <w:pPr>
+              <w:pStyle w:val="Compact"/>
+            </w:pPr>
+            <w:r>
+              <w:rPr>
+                <w:b/>
+              </w:rPr>
               <w:t xml:space="preserve">amplitude</w:t>
             </w:r>
           </w:p>
@@ -4448,7 +5009,7 @@
         <w:pStyle w:val="BodyText"/>
       </w:pPr>
       <w:r>
-        <w:t xml:space="preserve">O desvio-padrão cresceu de ±0,020 em T=0,4 para ±0,049 em T=0,8, nível no qual a amplitude entre repetições passou a cobrir de 0,645 a 0,765. Em termos de média, T=0,4 ficou marginalmente acima do greedy e T=0,8, abaixo. A Figura 6 apresenta as médias com seus desvios e os pontos das repetições individuais.</w:t>
+        <w:t xml:space="preserve">O desvio-padrão cresceu de ±0,020 em T=0,4 para ±0,049 em T=0,8, nível no qual a amplitude entre repetições passou a cobrir de 0,645 a 0,765. Em termos de média, T=0,4 situou-se marginalmente acima do greedy e T=0,8, abaixo. A Figura 6 apresenta as médias com seus desvios e os pontos das repetições individuais.</w:t>
       </w:r>
     </w:p>
     <w:p>
@@ -4580,7 +5141,7 @@
         <w:t xml:space="preserve"> </w:t>
       </w:r>
       <w:r>
-        <w:t xml:space="preserve">e, por isso, não executa no pipeline chat do DIN-SQL: a primeira chamada trava. Acessado por endpoint</w:t>
+        <w:t xml:space="preserve">e, por essa razão, não executa no pipeline chat do DIN-SQL: a primeira chamada trava. Acessado por endpoint</w:t>
       </w:r>
       <w:r>
         <w:t xml:space="preserve"> </w:t>
@@ -4593,7 +5154,7 @@
         <w:t xml:space="preserve">completion</w:t>
       </w:r>
       <w:r>
-        <w:t xml:space="preserve">, ele de fato roda, mas os prompts decompostos do DIN-SQL não correspondem ao formato que espera. Documentamos o caso como uma limitação de compatibilidade e o substituímos pelos cinco backbones</w:t>
+        <w:t xml:space="preserve">, o modelo executa, mas os prompts decompostos do DIN-SQL não correspondem ao formato que ele espera. Documentamos o caso como uma limitação de compatibilidade e o substituímos pelos cinco backbones</w:t>
       </w:r>
       <w:r>
         <w:t xml:space="preserve"> </w:t>
@@ -4628,7 +5189,7 @@
         <w:pStyle w:val="FirstParagraph"/>
       </w:pPr>
       <w:r>
-        <w:t xml:space="preserve">Os experimentos da Seção 4 permitem responder, uma a uma, às quatro hipóteses formuladas na metodologia. Adiantamos a conclusão: a reprodução do desempenho global do DIN-SQL foi bem-sucedida com um modelo aberto a custo zero, mas a</w:t>
+        <w:t xml:space="preserve">Os experimentos da Seção 4 permitem avaliar individualmente as quatro hipóteses formuladas na metodologia. Antecipamos a conclusão geral: a reprodução do desempenho global do DIN-SQL foi bem-sucedida com um modelo aberto a custo financeiro nulo, mas a</w:t>
       </w:r>
       <w:r>
         <w:t xml:space="preserve"> </w:t>
@@ -4644,7 +5205,7 @@
         <w:t xml:space="preserve"> </w:t>
       </w:r>
       <w:r>
-        <w:t xml:space="preserve">da contribuição de cada parte do método mudou de forma relevante quando trocamos o GPT-4 por</w:t>
+        <w:t xml:space="preserve">da contribuição de cada componente do método alterou-se de modo relevante ao substituirmos o GPT-4 por</w:t>
       </w:r>
       <w:r>
         <w:t xml:space="preserve"> </w:t>
@@ -4660,7 +5221,7 @@
         <w:t xml:space="preserve"> </w:t>
       </w:r>
       <w:r>
-        <w:t xml:space="preserve">abertos contemporâneos. É nessa mudança que reside o achado central deste trabalho.</w:t>
+        <w:t xml:space="preserve">abertos contemporâneos. Nessa alteração reside o achado central deste trabalho.</w:t>
       </w:r>
     </w:p>
     <w:bookmarkStart w:id="49" w:name="Xda48ee67ba6f2ee821622c7b50a71bbcaeb4797"/>
@@ -4677,7 +5238,7 @@
         <w:pStyle w:val="FirstParagraph"/>
       </w:pPr>
       <w:r>
-        <w:t xml:space="preserve">Nossa primeira hipótese sustentava que um</w:t>
+        <w:t xml:space="preserve">Nossa primeira hipótese postulava que um</w:t>
       </w:r>
       <w:r>
         <w:t xml:space="preserve"> </w:t>
@@ -4693,7 +5254,7 @@
         <w:t xml:space="preserve"> </w:t>
       </w:r>
       <w:r>
-        <w:t xml:space="preserve">aberto de aproximadamente 7B, operado sob o mesmo pipeline DIN-SQL, atingiria EX comparável ao GPT-4 reportado no artigo original. Os dados confirmam essa expectativa de maneira quase literal: o Qwen2.5-Coder-7B obteve EX = 0,745 no subset, contra 0,742 do DIN-SQL+GPT-4 no Spider dev. A diferença é de três décimos de ponto percentual, e o intervalo de confiança bootstrap de 95% do Qwen, [0,680, 0,805], contém com folga o valor de referência do paper. Não há, portanto, qualquer evidência de que o modelo aberto seja inferior ao GPT-4 nesta tarefa e neste regime de avaliação.</w:t>
+        <w:t xml:space="preserve">aberto de aproximadamente 7B de parâmetros, operado sob o pipeline DIN-SQL, atingiria EX comparável ao reportado para o GPT-4 no artigo original. Os dados confirmam essa expectativa de forma quase exata: o Qwen2.5-Coder-7B obteve EX = 0,745 no subset, contra 0,742 do DIN-SQL+GPT-4 no Spider dev. A diferença é de três décimos de ponto percentual, e o intervalo de confiança bootstrap de 95% do Qwen, [0,680, 0,805], contém com folga o valor de referência do artigo. Não há, portanto, evidência de que o modelo aberto seja inferior ao GPT-4 nesta tarefa e neste regime de avaliação.</w:t>
       </w:r>
       <w:r>
         <w:t xml:space="preserve"> </w:t>
@@ -4711,7 +5272,7 @@
         <w:pStyle w:val="BodyText"/>
       </w:pPr>
       <w:r>
-        <w:t xml:space="preserve">A leitura por dificuldade, ilustrada na Figura 7, qualifica o que significa "empatar" e torna o resultado mais interessante. O Qwen fica abaixo do GPT-4 nos estratos mais fáceis (easy 0,814 vs 0,911; medium 0,729 vs 0,798), mas alcança e supera o paper nas faixas difíceis: 0,686 vs 0,649 no hard e 0,680 vs 0,434 no extra. O ganho no extra é expressivo — cerca de 25 pontos percentuais. Esse padrão sugere que o empate agregado não vem de um desempenho uniformemente equivalente, e sim de uma compensação: o Qwen perde um pouco onde já era fácil acertar e recupera onde está o desafio real. É justamente por causa desse contraste que reportamos a comparação com o paper sempre por dificuldade, e não pelo número agregado — ponto ao qual voltaremos na Seção 6.</w:t>
+        <w:t xml:space="preserve">A análise desagregada por dificuldade, ilustrada na Figura 7, qualifica o sentido dessa equivalência. O Qwen situa-se abaixo do GPT-4 nos estratos mais fáceis (easy 0,814 vs 0,911; medium 0,729 vs 0,798), mas iguala ou supera a referência nas faixas difíceis: 0,686 vs 0,649 no hard e 0,680 vs 0,434 no extra. O ganho no estrato extra é expressivo, da ordem de 25 pontos percentuais. Esse padrão indica que a equivalência agregada não decorre de um desempenho uniformemente equivalente, mas de um efeito de compensação: o Qwen perde margem onde a tarefa já é fácil e a recupera onde está concentrada a dificuldade real. É precisamente em razão desse contraste que reportamos a comparação com o artigo sempre por dificuldade, e não pelo valor agregado, ponto ao qual retornamos na Seção 6.</w:t>
       </w:r>
     </w:p>
     <w:bookmarkEnd w:id="49"/>
@@ -4745,7 +5306,7 @@
         <w:t xml:space="preserve"> </w:t>
       </w:r>
       <w:r>
-        <w:t xml:space="preserve">módulo do DIN-SQL contribui para o EX, de modo que removê-lo o degradaria — produziu os resultados mais surpreendentes, e é onde o estudo de fato vai além de uma simples reprodução. A ablação no Qwen, resumida na Tabela 2 e nas Figuras 4 e 5, revela um quadro bem mais matizado do que a hipótese previa.</w:t>
+        <w:t xml:space="preserve">módulo do DIN-SQL contribui para o EX, de modo que sua remoção o degradaria — produziu os resultados mais relevantes do estudo, nos quais este trabalho ultrapassa uma simples reprodução. A ablação no Qwen, sintetizada na Tabela 2 e nas Figuras 4 e 5, revela um quadro mais matizado do que a hipótese previa.</w:t>
       </w:r>
       <w:r>
         <w:t xml:space="preserve"> </w:t>
@@ -4763,7 +5324,7 @@
         <w:pStyle w:val="BodyText"/>
       </w:pPr>
       <w:r>
-        <w:t xml:space="preserve">O único módulo que se comporta como o paper antecipa é a</w:t>
+        <w:t xml:space="preserve">O único módulo que se comporta conforme o previsto no artigo original é a</w:t>
       </w:r>
       <w:r>
         <w:t xml:space="preserve"> </w:t>
@@ -4776,7 +5337,23 @@
         <w:t xml:space="preserve">self-correction</w:t>
       </w:r>
       <w:r>
-        <w:t xml:space="preserve">. Removê-la derruba o EX de 0,745 para 0,665 (Δ = −0,080), com efeito altamente significativo no McNemar pareado (p &lt; 0,001, Cohen's h = −0,176). O colapso concentra-se exatamente onde mais dói: o EX no hard cai para 0,543 e no extra para 0,400. Esse é, isoladamente, o componente mais valioso do andaime do DIN-SQL, e o achado coincide com o relato original dos autores.</w:t>
+        <w:t xml:space="preserve">. Sua remoção reduz o EX de 0,745 para 0,665 (Δ = −0,080), com efeito altamente significativo no teste de McNemar pareado (p &lt; 0,001; Cohen's h = −0,176). A degradação concentra-se nos estratos mais exigentes: o EX no hard cai para 0,543 e no extra para 0,400. Esse é, isoladamente, o componente mais relevante do</w:t>
+      </w:r>
+      <w:r>
+        <w:t xml:space="preserve"> </w:t>
+      </w:r>
+      <w:r>
+        <w:rPr>
+          <w:i/>
+          <w:iCs/>
+        </w:rPr>
+        <w:t xml:space="preserve">scaffolding</w:t>
+      </w:r>
+      <w:r>
+        <w:t xml:space="preserve"> </w:t>
+      </w:r>
+      <w:r>
+        <w:t xml:space="preserve">do DIN-SQL, e o resultado coincide com o relato dos autores originais.</w:t>
       </w:r>
     </w:p>
     <w:p>
@@ -4784,7 +5361,7 @@
         <w:pStyle w:val="BodyText"/>
       </w:pPr>
       <w:r>
-        <w:t xml:space="preserve">Os demais módulos contam outra história. O</w:t>
+        <w:t xml:space="preserve">Os demais módulos apresentam comportamento distinto. O</w:t>
       </w:r>
       <w:r>
         <w:t xml:space="preserve"> </w:t>
@@ -4813,7 +5390,23 @@
         <w:t xml:space="preserve">neutro</w:t>
       </w:r>
       <w:r>
-        <w:t xml:space="preserve">: ao desligá-lo, o EX subiu marginalmente (Δ = +0,020), e o McNemar não detectou diferença (p = 0,556). A interpretação mais natural é que um coder moderno como o Qwen já realiza o vínculo entre pergunta e esquema de forma implícita, durante a própria geração, de modo que o passo explícito acrescenta sobretudo ruído. Mais provocativo ainda é o comportamento da etapa de</w:t>
+        <w:t xml:space="preserve">: seu desligamento elevou o EX apenas marginalmente (Δ = +0,020), sem diferença detectável pelo McNemar (p = 0,556). A interpretação mais plausível é que um</w:t>
+      </w:r>
+      <w:r>
+        <w:t xml:space="preserve"> </w:t>
+      </w:r>
+      <w:r>
+        <w:rPr>
+          <w:i/>
+          <w:iCs/>
+        </w:rPr>
+        <w:t xml:space="preserve">coder</w:t>
+      </w:r>
+      <w:r>
+        <w:t xml:space="preserve"> </w:t>
+      </w:r>
+      <w:r>
+        <w:t xml:space="preserve">moderno como o Qwen já realiza o vínculo entre pergunta e esquema de forma implícita, durante a própria geração, de modo que o passo explícito acrescenta sobretudo ruído. Mais notável é o comportamento da etapa de</w:t>
       </w:r>
       <w:r>
         <w:t xml:space="preserve"> </w:t>
@@ -4842,23 +5435,7 @@
         <w:t xml:space="preserve"> </w:t>
       </w:r>
       <w:r>
-        <w:t xml:space="preserve">simples para todas as queries elevou o EX a 0,790 (Δ = +0,045, p = 0,049, h = +0,107), enquanto forçar o caminho de CoT decomposto para todas piorou para 0,675 (Δ = −0,070, p = 0,026, h = −0,155). Ou seja, em vez de ajudar uniformemente, a maquinaria de decomposição chega a</w:t>
-      </w:r>
-      <w:r>
-        <w:t xml:space="preserve"> </w:t>
-      </w:r>
-      <w:r>
-        <w:rPr>
-          <w:i/>
-          <w:iCs/>
-        </w:rPr>
-        <w:t xml:space="preserve">atrapalhar</w:t>
-      </w:r>
-      <w:r>
-        <w:t xml:space="preserve"> </w:t>
-      </w:r>
-      <w:r>
-        <w:t xml:space="preserve">quando aplicada de forma indiscriminada.</w:t>
+        <w:t xml:space="preserve">simples para todas as consultas elevou o EX a 0,790 (Δ = +0,045; p = 0,049; h = +0,107), enquanto forçar o caminho de CoT decomposto para todas o reduziu a 0,675 (Δ = −0,070; p = 0,026; h = −0,155). Em vez de auxiliar de modo uniforme, a maquinaria de decomposição chega, portanto, a prejudicar o desempenho quando aplicada indiscriminadamente.</w:t>
       </w:r>
     </w:p>
     <w:p>
@@ -4866,7 +5443,7 @@
         <w:pStyle w:val="BodyText"/>
       </w:pPr>
       <w:r>
-        <w:t xml:space="preserve">Daí emerge o que chamamos de</w:t>
+        <w:t xml:space="preserve">Disso emerge o que designamos como</w:t>
       </w:r>
       <w:r>
         <w:t xml:space="preserve"> </w:t>
@@ -4895,7 +5472,23 @@
         <w:t xml:space="preserve"> </w:t>
       </w:r>
       <w:r>
-        <w:t xml:space="preserve">de 7B contemporâneos, parte do andaime concebido para a era CodeX/GPT-4 tornou-se redundante. O que ainda paga é a self-correction; o schema-linking ficou neutro; e a decomposição em prompts complexos só se justifica nos casos mais difíceis. A leitura por dificuldade da ablação confirma o</w:t>
+        <w:t xml:space="preserve">de 7B contemporâneos, parte do</w:t>
+      </w:r>
+      <w:r>
+        <w:t xml:space="preserve"> </w:t>
+      </w:r>
+      <w:r>
+        <w:rPr>
+          <w:i/>
+          <w:iCs/>
+        </w:rPr>
+        <w:t xml:space="preserve">scaffolding</w:t>
+      </w:r>
+      <w:r>
+        <w:t xml:space="preserve"> </w:t>
+      </w:r>
+      <w:r>
+        <w:t xml:space="preserve">concebido para a era CodeX/GPT-4 tornou-se redundante. A self-correction permanece vantajosa; o schema-linking tornou-se neutro; e a decomposição em prompts complexos justifica-se apenas nos casos mais difíceis. A análise por dificuldade da ablação confirma o</w:t>
       </w:r>
       <w:r>
         <w:t xml:space="preserve"> </w:t>
@@ -4911,7 +5504,7 @@
         <w:t xml:space="preserve"> </w:t>
       </w:r>
       <w:r>
-        <w:t xml:space="preserve">simples-vs-decomposto que o próprio paper descreve: o</w:t>
+        <w:t xml:space="preserve">entre prompts simples e decompostos descrito no próprio artigo: o</w:t>
       </w:r>
       <w:r>
         <w:t xml:space="preserve"> </w:t>
@@ -4927,7 +5520,7 @@
         <w:t xml:space="preserve"> </w:t>
       </w:r>
       <w:r>
-        <w:t xml:space="preserve">simples vence o full no easy (0,871 vs 0,814), no medium (0,814 vs 0,729) e no hard (0,743 vs 0,686), e só perde no</w:t>
+        <w:t xml:space="preserve">simples supera a configuração full no easy (0,871 vs 0,814), no medium (0,814 vs 0,729) e no hard (0,743 vs 0,686), perdendo apenas no</w:t>
       </w:r>
       <w:r>
         <w:t xml:space="preserve"> </w:t>
@@ -4943,7 +5536,7 @@
         <w:t xml:space="preserve"> </w:t>
       </w:r>
       <w:r>
-        <w:t xml:space="preserve">(0,560 vs 0,680). A decomposição completa, portanto, paga sua complexidade apenas nas queries extra-difíceis. Para o Qwen, a engrenagem inteira do DIN-SQL é vantajosa precisamente quando o problema é mais duro, e não como regra geral.</w:t>
+        <w:t xml:space="preserve">(0,560 vs 0,680). A decomposição completa, assim, compensa sua complexidade somente nas consultas extra-difíceis. Para o Qwen, o conjunto integral do pipeline DIN-SQL é vantajoso precisamente quando o problema é mais difícil, e não como regra geral.</w:t>
       </w:r>
     </w:p>
     <w:bookmarkEnd w:id="50"/>
@@ -4961,7 +5554,7 @@
         <w:pStyle w:val="FirstParagraph"/>
       </w:pPr>
       <w:r>
-        <w:t xml:space="preserve">A terceira hipótese previa diferença significativa de EX entre os cinco backbones. O teste de Friedman a sustenta no agregado (χ² = 14,379, p = 0,0062): existe, sim, heterogeneidade global entre os modelos, visível na Figura 1.</w:t>
+        <w:t xml:space="preserve">A terceira hipótese previa diferença significativa de EX entre os cinco backbones. O teste de Friedman a sustenta no agregado (χ² = 14,379; p = 0,0062): há, de fato, heterogeneidade global entre os modelos, visível na Figura 1.</w:t>
       </w:r>
       <w:r>
         <w:t xml:space="preserve"> </w:t>
@@ -4974,7 +5567,7 @@
         <w:t xml:space="preserve">Consideramos H3 sustentada globalmente</w:t>
       </w:r>
       <w:r>
-        <w:t xml:space="preserve">, mas com uma ressalva importante revelada pelo post-hoc.</w:t>
+        <w:t xml:space="preserve">, com uma ressalva importante revelada pelo post-hoc.</w:t>
       </w:r>
     </w:p>
     <w:p>
@@ -4998,7 +5591,39 @@
         <w:t xml:space="preserve"> </w:t>
       </w:r>
       <w:r>
-        <w:t xml:space="preserve">sobrevive (p = 0,001, p_adj = 0,013, h = +0,249). Os demais pares entre os coders maiores não se distinguem: Qwen vs DeepSeek (p = 0,890), Qwen vs Yi (p = 0,665) e Qwen vs Granite no limiar (p = 0,050, perdendo a significância após Holm). Em outras palavras, a diferença global é puxada essencialmente pelo Phi-3.5-mini (3,8B) ficar atrás; os três coders de 7–9B (Qwen, DeepSeek, Yi)</w:t>
+        <w:t xml:space="preserve">permanece significativo (p = 0,001; p_adj = 0,013; h = +0,249). Os demais pares entre os</w:t>
+      </w:r>
+      <w:r>
+        <w:t xml:space="preserve"> </w:t>
+      </w:r>
+      <w:r>
+        <w:rPr>
+          <w:i/>
+          <w:iCs/>
+        </w:rPr>
+        <w:t xml:space="preserve">coders</w:t>
+      </w:r>
+      <w:r>
+        <w:t xml:space="preserve"> </w:t>
+      </w:r>
+      <w:r>
+        <w:t xml:space="preserve">maiores não se distinguem: Qwen vs DeepSeek (p = 0,890), Qwen vs Yi (p = 0,665) e Qwen vs Granite no limiar (p = 0,050, que perde a significância após a correção de Holm). Em síntese, a diferença global é determinada essencialmente pelo desempenho inferior do Phi-3.5-mini (3,8B); os três</w:t>
+      </w:r>
+      <w:r>
+        <w:t xml:space="preserve"> </w:t>
+      </w:r>
+      <w:r>
+        <w:rPr>
+          <w:i/>
+          <w:iCs/>
+        </w:rPr>
+        <w:t xml:space="preserve">coders</w:t>
+      </w:r>
+      <w:r>
+        <w:t xml:space="preserve"> </w:t>
+      </w:r>
+      <w:r>
+        <w:t xml:space="preserve">de 7–9B (Qwen, DeepSeek, Yi)</w:t>
       </w:r>
       <w:r>
         <w:t xml:space="preserve"> </w:t>
@@ -5011,7 +5636,7 @@
         <w:t xml:space="preserve">empatam estatisticamente</w:t>
       </w:r>
       <w:r>
-        <w:t xml:space="preserve">, com EX entre 0,725 e 0,745. Dentro dessa faixa de capacidade, a escolha do backbone é praticamente indiferente para o desempenho final — uma boa notícia para quem pretende reproduzir o método com recursos limitados.</w:t>
+        <w:t xml:space="preserve">, com EX entre 0,725 e 0,745. Dentro dessa faixa de capacidade, a escolha do backbone é praticamente indiferente para o desempenho final, o que constitui resultado favorável à reprodução do método com recursos limitados.</w:t>
       </w:r>
     </w:p>
     <w:bookmarkEnd w:id="51"/>
@@ -5029,7 +5654,7 @@
         <w:pStyle w:val="FirstParagraph"/>
       </w:pPr>
       <w:r>
-        <w:t xml:space="preserve">A quarta hipótese afirmava que aumentar a temperatura elevaria a variabilidade do EX</w:t>
+        <w:t xml:space="preserve">A quarta hipótese afirmava que o aumento da temperatura elevaria a variabilidade do EX</w:t>
       </w:r>
       <w:r>
         <w:t xml:space="preserve"> </w:t>
@@ -5045,7 +5670,7 @@
         <w:t xml:space="preserve"> </w:t>
       </w:r>
       <w:r>
-        <w:t xml:space="preserve">ganho na média. Os dados de robustez (Figura 6) confirmam a ausência de ganho de forma clara, e essa é a parte mais sólida do veredito.</w:t>
+        <w:t xml:space="preserve">ganho na média. Os dados de robustez (Figura 6) confirmam a ausência de ganho de forma inequívoca, e esta é a parte mais sólida do veredito.</w:t>
       </w:r>
       <w:r>
         <w:t xml:space="preserve"> </w:t>
@@ -5061,7 +5686,7 @@
         <w:t xml:space="preserve"> </w:t>
       </w:r>
       <w:r>
-        <w:t xml:space="preserve">O greedy (T = 0,0) entrega EX = 0,745; T = 0,4 fica marginalmente acima, em 0,758 ± 0,020; e T = 0,8 cai para 0,719 ± 0,049. O teste de Kruskal-Wallis não detecta efeito da temperatura sobre a média (p = 0,116), de modo que nenhuma temperatura positiva supera o greedy de forma estatisticamente defensável.</w:t>
+        <w:t xml:space="preserve">A decodificação greedy (T = 0,0) entrega EX = 0,745; T = 0,4 situa-se marginalmente acima, em 0,758 ± 0,020; e T = 0,8 reduz-se a 0,719 ± 0,049. O teste de Kruskal-Wallis não detecta efeito da temperatura sobre a média (p = 0,116), de modo que nenhuma temperatura positiva supera o greedy de forma estatisticamente defensável.</w:t>
       </w:r>
     </w:p>
     <w:p>
@@ -5069,7 +5694,7 @@
         <w:pStyle w:val="BodyText"/>
       </w:pPr>
       <w:r>
-        <w:t xml:space="preserve">Quanto à parte da hipótese que tratava da variabilidade, a evidência é sugestiva, porém mais frágil. O desvio em T = 0,8 é cerca de 2,5 vezes o de T = 0,4, e a amplitude observada em T = 0,8 chega a 12 pontos (de 0,645 a 0,765 — ou seja, uma corrida isolada despencou para 0,645). Ainda assim, o teste de Levene não confirma diferença significativa entre as variâncias (p = 0,273): com apenas N = 5 repetições, falta poder estatístico para cravar o aumento. O crescimento da variabilidade é, então,</w:t>
+        <w:t xml:space="preserve">Quanto à parte da hipótese relativa à variabilidade, a evidência é sugestiva, porém mais frágil. O desvio em T = 0,8 é cerca de 2,5 vezes o de T = 0,4, e a amplitude observada em T = 0,8 atinge 12 pontos (de 0,645 a 0,765 — isto é, uma execução isolada caiu para 0,645). Ainda assim, o teste de Levene não confirma diferença significativa entre as variâncias (p = 0,273): com apenas N = 5 repetições, falta poder estatístico para estabelecer o aumento. O crescimento da variabilidade é, portanto,</w:t>
       </w:r>
       <w:r>
         <w:t xml:space="preserve"> </w:t>
@@ -5085,17 +5710,17 @@
         <w:t xml:space="preserve"> </w:t>
       </w:r>
       <w:r>
-        <w:t xml:space="preserve">e plausível, mas não significativo no nosso desenho. Vale registrar que as amostras de EX entre repetições passaram no Shapiro-Wilk (T = 0,4 p = 0,236; T = 0,8 p = 0,435), o que legitima o uso dos testes paramétricos de variância nesse ponto. A recomendação prática é direta e alinhada ao paper:</w:t>
-      </w:r>
-      <w:r>
-        <w:t xml:space="preserve"> </w:t>
-      </w:r>
-      <w:r>
-        <w:rPr>
-          <w:b/>
-          <w:bCs/>
-        </w:rPr>
-        <w:t xml:space="preserve">greedy (temp = 0) é a escolha segura e reprodutível</w:t>
+        <w:t xml:space="preserve">e plausível, mas não significativo em nosso desenho. Registramos que as amostras de EX entre repetições passaram no teste de Shapiro-Wilk (T = 0,4 p = 0,236; T = 0,8 p = 0,435), o que legitima o uso dos testes paramétricos de variância nesse ponto. A recomendação prática é direta e alinhada ao artigo original:</w:t>
+      </w:r>
+      <w:r>
+        <w:t xml:space="preserve"> </w:t>
+      </w:r>
+      <w:r>
+        <w:rPr>
+          <w:b/>
+          <w:bCs/>
+        </w:rPr>
+        <w:t xml:space="preserve">a decodificação greedy (temperatura 0) é a escolha segura e reprodutível</w:t>
       </w:r>
       <w:r>
         <w:t xml:space="preserve">, pois entrega desempenho competitivo sem o risco de quedas pontuais.</w:t>
@@ -5116,7 +5741,7 @@
         <w:pStyle w:val="FirstParagraph"/>
       </w:pPr>
       <w:r>
-        <w:t xml:space="preserve">Um episódio à margem do desenho principal reforça, de modo eloquente, a leitura acima sobre dependência de capacidade. O</w:t>
+        <w:t xml:space="preserve">Um episódio à margem do desenho principal reforça a leitura precedente sobre a dependência de capacidade. O</w:t>
       </w:r>
       <w:r>
         <w:t xml:space="preserve"> </w:t>
@@ -5144,7 +5769,7 @@
         <w:t xml:space="preserve"> </w:t>
       </w:r>
       <w:r>
-        <w:t xml:space="preserve">e sem</w:t>
+        <w:t xml:space="preserve">e desprovido de</w:t>
       </w:r>
       <w:r>
         <w:t xml:space="preserve"> </w:t>
@@ -5157,20 +5782,20 @@
         <w:t xml:space="preserve">chat template</w:t>
       </w:r>
       <w:r>
-        <w:t xml:space="preserve">, simplesmente</w:t>
-      </w:r>
-      <w:r>
-        <w:t xml:space="preserve"> </w:t>
-      </w:r>
-      <w:r>
-        <w:rPr>
-          <w:b/>
-          <w:bCs/>
-        </w:rPr>
-        <w:t xml:space="preserve">não roda no pipeline chat do DIN-SQL</w:t>
-      </w:r>
-      <w:r>
-        <w:t xml:space="preserve">: trava já na primeira chamada, porque os prompts decompostos não correspondem ao formato que ele espera. Esse não é um defeito de configuração contornável, e sim uma incompatibilidade de fundo — o prompting decomposto pressupõe</w:t>
+        <w:t xml:space="preserve">,</w:t>
+      </w:r>
+      <w:r>
+        <w:t xml:space="preserve"> </w:t>
+      </w:r>
+      <w:r>
+        <w:rPr>
+          <w:b/>
+          <w:bCs/>
+        </w:rPr>
+        <w:t xml:space="preserve">não executa no pipeline chat do DIN-SQL</w:t>
+      </w:r>
+      <w:r>
+        <w:t xml:space="preserve">: trava já na primeira chamada, pois os prompts decompostos não correspondem ao formato que ele espera. Não se trata de um defeito de configuração contornável, mas de uma incompatibilidade de fundo: o prompting decomposto pressupõe</w:t>
       </w:r>
       <w:r>
         <w:t xml:space="preserve"> </w:t>
@@ -5186,7 +5811,23 @@
         <w:t xml:space="preserve"> </w:t>
       </w:r>
       <w:r>
-        <w:t xml:space="preserve">geral, habilidade que um modelo de completion estritamente especializado não possui. O caso conecta-se diretamente à tese do artigo original sobre a natureza emergente do método: o DIN-SQL não é apenas um conjunto de prompts, mas uma técnica que só "pega" sobre modelos com capacidade de seguir instruções complexas. A mesma lógica explica, no outro extremo de capacidade, por que o Phi-3.5-mini (3,8B) colapsa no hard (EX = 0,400): quando a habilidade subjacente enfraquece, o andaime deixa de sustentar o desempenho.</w:t>
+        <w:t xml:space="preserve">geral, habilidade que um modelo de completion estritamente especializado não possui. O caso conecta-se diretamente à tese do artigo original sobre a natureza emergente do método: o DIN-SQL não é apenas um conjunto de prompts, mas uma técnica que só se efetiva sobre modelos capazes de seguir instruções complexas. A mesma lógica explica, no extremo oposto de capacidade, por que o Phi-3.5-mini (3,8B) colapsa no estrato hard (EX = 0,400): quando a habilidade subjacente enfraquece, o</w:t>
+      </w:r>
+      <w:r>
+        <w:t xml:space="preserve"> </w:t>
+      </w:r>
+      <w:r>
+        <w:rPr>
+          <w:i/>
+          <w:iCs/>
+        </w:rPr>
+        <w:t xml:space="preserve">scaffolding</w:t>
+      </w:r>
+      <w:r>
+        <w:t xml:space="preserve"> </w:t>
+      </w:r>
+      <w:r>
+        <w:t xml:space="preserve">deixa de sustentar o desempenho.</w:t>
       </w:r>
     </w:p>
     <w:bookmarkEnd w:id="53"/>
@@ -5204,7 +5845,7 @@
         <w:pStyle w:val="FirstParagraph"/>
       </w:pPr>
       <w:r>
-        <w:t xml:space="preserve">Por fim, todos os backbones exibem um descompasso considerável entre EX e EM (Figura 3), conforme já antecipado pelos autores do DIN-SQL. O gap vai de 0,125 no Qwen, passando por Yi (0,185) e Granite (0,210), até Phi (0,275) e DeepSeek (0,280). A interpretação é a esperada para geração in-context: os modelos produzem SQL</w:t>
+        <w:t xml:space="preserve">Por fim, todos os backbones exibem um descompasso considerável entre EX e EM (Figura 3), conforme antecipado pelos autores do DIN-SQL. O gap varia de 0,125 no Qwen, passando por Yi (0,185) e Granite (0,210), até Phi (0,275) e DeepSeek (0,280). A interpretação é a esperada para geração in-context: os modelos produzem SQL</w:t>
       </w:r>
       <w:r>
         <w:t xml:space="preserve"> </w:t>
@@ -5220,7 +5861,7 @@
         <w:t xml:space="preserve"> </w:t>
       </w:r>
       <w:r>
-        <w:t xml:space="preserve">— que retorna o resultado certo no banco, e portanto acerta o EX — mas</w:t>
+        <w:t xml:space="preserve">— que retorna o resultado adequado no banco e, portanto, acerta o EX — porém</w:t>
       </w:r>
       <w:r>
         <w:t xml:space="preserve"> </w:t>
@@ -5236,23 +5877,23 @@
         <w:t xml:space="preserve"> </w:t>
       </w:r>
       <w:r>
-        <w:t xml:space="preserve">da consulta de referência, o que penaliza o EM, métrica de casamento exato de cláusulas. Curiosamente, em EM o próprio Qwen (0,620) fica acima do valor de referência do GPT-4 (0,601); o que distingue os modelos abertos é, antes, a</w:t>
-      </w:r>
-      <w:r>
-        <w:t xml:space="preserve"> </w:t>
-      </w:r>
-      <w:r>
-        <w:rPr>
-          <w:i/>
-          <w:iCs/>
-        </w:rPr>
-        <w:t xml:space="preserve">largura</w:t>
-      </w:r>
-      <w:r>
-        <w:t xml:space="preserve"> </w:t>
-      </w:r>
-      <w:r>
-        <w:t xml:space="preserve">do gap interno entre suas duas métricas. O caso do DeepSeek-Coder é ilustrativo: ele praticamente empata com o Qwen em EX (0,735 vs 0,745), mas tem o maior gap (0,280), o que aponta um modelo que "resolve" a query por caminhos sintáticos próprios, distantes da formulação canônica. É por gerar SQL correto em execução, mas idiossincrático em forma, que tratamos o EX como métrica primária e o EM apenas como complemento.</w:t>
+        <w:t xml:space="preserve">da consulta de referência, o que penaliza o EM, métrica de casamento exato de cláusulas. Cabe notar que, em EM, o próprio Qwen (0,620) supera o valor de referência do GPT-4 (0,601); o que distingue os modelos abertos é, antes, a</w:t>
+      </w:r>
+      <w:r>
+        <w:t xml:space="preserve"> </w:t>
+      </w:r>
+      <w:r>
+        <w:rPr>
+          <w:i/>
+          <w:iCs/>
+        </w:rPr>
+        <w:t xml:space="preserve">amplitude</w:t>
+      </w:r>
+      <w:r>
+        <w:t xml:space="preserve"> </w:t>
+      </w:r>
+      <w:r>
+        <w:t xml:space="preserve">do gap interno entre suas duas métricas. O caso do DeepSeek-Coder é ilustrativo: pratica empate com o Qwen em EX (0,735 vs 0,745), mas apresenta o maior gap (0,280), o que indica um modelo que resolve a consulta por caminhos sintáticos próprios, distantes da formulação canônica. Por gerar SQL correto em execução, mas idiossincrático na forma, adotamos o EX como métrica primária e o EM apenas como complemento.</w:t>
       </w:r>
     </w:p>
     <w:bookmarkEnd w:id="54"/>
@@ -5301,7 +5942,7 @@
         <w:t xml:space="preserve">Execution Accuracy compara o resultado da query predita com o da query de referência no banco específico</w:t>
       </w:r>
       <w:r>
-        <w:t xml:space="preserve">, o que pode gerar</w:t>
+        <w:t xml:space="preserve">, procedimento suscetível a</w:t>
       </w:r>
       <w:r>
         <w:t xml:space="preserve"> </w:t>
@@ -5314,7 +5955,7 @@
         <w:t xml:space="preserve">falsos positivos</w:t>
       </w:r>
       <w:r>
-        <w:t xml:space="preserve">: duas consultas distintas — uma correta e outra apenas acidentalmente coincidente — podem retornar o mesmo conjunto de linhas naquele banco particular e ambas serem contadas como acerto. Mitigamos parcialmente esse risco ao adotar o avaliador oficial test-suite-sql-eval, que reduz coincidências espúrias, e ao reportar o EM como métrica complementar — embora, como discutido em 5.6, o próprio EM tenha suas limitações no contexto de geração in-context.</w:t>
+        <w:t xml:space="preserve">: duas consultas distintas — uma correta e outra apenas acidentalmente coincidente — podem retornar o mesmo conjunto de linhas naquele banco particular e ser ambas contabilizadas como acerto. Mitigamos parcialmente esse risco mediante a adoção do avaliador oficial test-suite-sql-eval, que reduz coincidências espúrias, e pelo reporte do EM como métrica complementar — embora, como discutido em 5.6, o próprio EM apresente limitações no contexto de geração in-context.</w:t>
       </w:r>
     </w:p>
     <w:p>
@@ -5322,7 +5963,7 @@
         <w:pStyle w:val="BodyText"/>
       </w:pPr>
       <w:r>
-        <w:t xml:space="preserve">Uma segunda ameaça interna está no</w:t>
+        <w:t xml:space="preserve">Uma segunda ameaça interna reside no</w:t>
       </w:r>
       <w:r>
         <w:t xml:space="preserve"> </w:t>
@@ -5335,7 +5976,7 @@
         <w:t xml:space="preserve">parsing da saída do modelo</w:t>
       </w:r>
       <w:r>
-        <w:t xml:space="preserve">: como operamos os backbones em formato de chat, é preciso extrair a SQL final do texto gerado, e uma extração imperfeita poderia subestimar o desempenho real. Esse risco foi mitigado pela rotina de limpeza (</w:t>
+        <w:t xml:space="preserve">: como operamos os backbones em formato de chat, é necessário extrair a SQL final do texto gerado, e uma extração imperfeita poderia subestimar o desempenho real. Esse risco foi mitigado pela rotina de limpeza (</w:t>
       </w:r>
       <w:r>
         <w:rPr>
@@ -5391,7 +6032,7 @@
         <w:t xml:space="preserve"> </w:t>
       </w:r>
       <w:r>
-        <w:t xml:space="preserve">— a mesma restrição do trabalho original, mas que impede afirmar que os achados se transferem para bancos de domínios distintos, esquemas mais complexos (como em BIRD) ou perguntas em outras línguas. Segundo, e mais importante,</w:t>
+        <w:t xml:space="preserve">— a mesma restrição do trabalho original, que impede afirmar que os achados se transferem para bancos de domínios distintos, esquemas mais complexos (como em BIRD) ou perguntas em outras línguas. Segundo, e de maior relevância,</w:t>
       </w:r>
       <w:r>
         <w:t xml:space="preserve"> </w:t>
@@ -5404,7 +6045,7 @@
         <w:t xml:space="preserve">a ablação foi conduzida em um único modelo, o Qwen2.5-Coder-7B</w:t>
       </w:r>
       <w:r>
-        <w:t xml:space="preserve">. O achado central sobre a redundância parcial do scaffolding — schema-linking neutro, classificação que pode atrapalhar — é, a rigor, uma afirmação sobre</w:t>
+        <w:t xml:space="preserve">. O achado central sobre a redundância parcial do scaffolding — schema-linking neutro e classificação potencialmente prejudicial — constitui, rigorosamente, uma afirmação sobre</w:t>
       </w:r>
       <w:r>
         <w:t xml:space="preserve"> </w:t>
@@ -5420,7 +6061,7 @@
         <w:t xml:space="preserve"> </w:t>
       </w:r>
       <w:r>
-        <w:t xml:space="preserve">coder, e não está demonstrado que se mantém nos demais backbones. É plausível que modelos mais fracos, como o Phi, ainda se beneficiem do schema-linking explícito, justamente por não realizarem o vínculo implicitamente. Generalizar o achado exigiria replicar a ablação em múltiplos modelos.</w:t>
+        <w:t xml:space="preserve">coder, sem demonstração de que se mantenha nos demais backbones. É plausível que modelos menos capazes, como o Phi, ainda se beneficiem do schema-linking explícito, justamente por não realizarem o vínculo de forma implícita. A generalização do achado exigiria replicar a ablação em múltiplos modelos.</w:t>
       </w:r>
     </w:p>
     <w:bookmarkEnd w:id="57"/>
@@ -5438,7 +6079,7 @@
         <w:pStyle w:val="FirstParagraph"/>
       </w:pPr>
       <w:r>
-        <w:t xml:space="preserve">Várias ressalvas estatísticas pesam sobre a força das nossas inferências. O subset tem</w:t>
+        <w:t xml:space="preserve">Diversas ressalvas estatísticas restringem a força de nossas inferências. O subset tem</w:t>
       </w:r>
       <w:r>
         <w:t xml:space="preserve"> </w:t>
@@ -5451,7 +6092,7 @@
         <w:t xml:space="preserve">n = 200</w:t>
       </w:r>
       <w:r>
-        <w:t xml:space="preserve">, o que implica erro-padrão da ordem de 3 pontos no EX; diferenças menores que isso estão, em princípio, dentro do ruído. O problema se agrava nos</w:t>
+        <w:t xml:space="preserve">, o que implica erro-padrão da ordem de 3 pontos no EX; diferenças inferiores a esse valor situam-se, em princípio, dentro do ruído. A limitação acentua-se nos</w:t>
       </w:r>
       <w:r>
         <w:t xml:space="preserve"> </w:t>
@@ -5480,7 +6121,7 @@
         <w:t xml:space="preserve"> </w:t>
       </w:r>
       <w:r>
-        <w:t xml:space="preserve">e o hard (n = 35): os números desses estratos — incluindo a vantagem expressiva do Qwen sobre o GPT-4 no extra — são os mais voláteis e devem ser lidos com cautela.</w:t>
+        <w:t xml:space="preserve">e o hard (n = 35): os valores desses estratos — incluindo a vantagem expressiva do Qwen sobre o GPT-4 no extra — são os mais voláteis e devem ser interpretados com cautela.</w:t>
       </w:r>
     </w:p>
     <w:p>
@@ -5504,7 +6145,7 @@
         <w:t xml:space="preserve"> </w:t>
       </w:r>
       <w:r>
-        <w:t xml:space="preserve">(cerca de 35% de easy no subset contra 24% no dev). Por isso, e como já frisado, comparamos com o paper</w:t>
+        <w:t xml:space="preserve">(cerca de 35% de easy no subset contra 24% no dev). Por essa razão, e conforme já assinalado, comparamos com o paper</w:t>
       </w:r>
       <w:r>
         <w:t xml:space="preserve"> </w:t>
@@ -5517,7 +6158,7 @@
         <w:t xml:space="preserve">por dificuldade</w:t>
       </w:r>
       <w:r>
-        <w:t xml:space="preserve">, e não pelo número agregado — o "all" do nosso subset e o "all" do dev não são diretamente comparáveis. Por fim, parte dos resultados da ablação é</w:t>
+        <w:t xml:space="preserve">, e não pelo número agregado — o "all" de nosso subset e o "all" do dev não são diretamente comparáveis. Por fim, parte dos resultados da ablação é</w:t>
       </w:r>
       <w:r>
         <w:t xml:space="preserve"> </w:t>
@@ -5546,7 +6187,7 @@
         <w:t xml:space="preserve"> </w:t>
       </w:r>
       <w:r>
-        <w:t xml:space="preserve">forçado tem p = 0,049, exatamente na borda do limiar convencional de 0,05. Tratamos esse achado como sugestivo, não como definitivo, e o mesmo cuidado vale para o contraste Qwen vs Granite (p = 0,050), que não sobrevive à correção de Holm.</w:t>
+        <w:t xml:space="preserve">forçado apresenta p = 0,049, exatamente na borda do limiar convencional de 0,05. Tratamos esse achado como sugestivo, e não definitivo, ressalva igualmente aplicável ao contraste Qwen vs Granite (p = 0,050), que não sobrevive à correção de Holm.</w:t>
       </w:r>
     </w:p>
     <w:bookmarkEnd w:id="58"/>
@@ -5564,7 +6205,7 @@
         <w:pStyle w:val="FirstParagraph"/>
       </w:pPr>
       <w:r>
-        <w:t xml:space="preserve">Cabe registrar, com transparência, que o estudo de robustez explorou</w:t>
+        <w:t xml:space="preserve">Registramos, por transparência, que o estudo de robustez explorou</w:t>
       </w:r>
       <w:r>
         <w:t xml:space="preserve"> </w:t>
@@ -5603,7 +6244,7 @@
         <w:t xml:space="preserve">não foi executado</w:t>
       </w:r>
       <w:r>
-        <w:t xml:space="preserve">. Assim, a conclusão de H4 sobre estabilidade vale especificamente para a decodificação por temperatura; a sensibilidade do método à quantidade e à seleção dos exemplos in-context permanece em aberto e fica indicada como trabalho futuro. Soma-se a isso o baixo número de repetições no regime estocástico (N = 5) que, como apontado em 5.4, limita o poder para confirmar diferenças de variância via Levene.</w:t>
+        <w:t xml:space="preserve">. Em consequência, a conclusão de H4 sobre estabilidade vale especificamente para a decodificação por temperatura; a sensibilidade do método à quantidade e à seleção dos exemplos in-context permanece em aberto e fica indicada como trabalho futuro. Soma-se a isso o reduzido número de repetições no regime estocástico (N = 5) que, como apontado em 5.4, limita o poder estatístico para confirmar diferenças de variância via Levene.</w:t>
       </w:r>
     </w:p>
     <w:bookmarkEnd w:id="59"/>
@@ -5622,7 +6263,23 @@
         <w:pStyle w:val="FirstParagraph"/>
       </w:pPr>
       <w:r>
-        <w:t xml:space="preserve">Neste trabalho reproduzimos o DIN-SQL substituindo o GPT-4 por code-LLMs abertos servidos localmente, e mostramos que o método pode ser replicado a custo zero sem perda mensurável de desempenho. Sobre o subset estratificado de 200 consultas do Spider dev, o Qwen2.5-Coder-7B alcançou EX de 0,745, praticamente idêntico ao 0,742 relatado para o DIN-SQL com GPT-4. O intervalo de confiança bootstrap de 95% que obtivemos para o nosso modelo, [0,680, 0,805], contém esse valor original — sinal de que a diferença entre os dois é indistinguível do ruído amostral. A comparação por dificuldade (Figura 7) detalha o quadro: ficamos abaixo nas consultas</w:t>
+        <w:t xml:space="preserve">Neste trabalho reproduzimos o DIN-SQL substituindo o GPT-4 por</w:t>
+      </w:r>
+      <w:r>
+        <w:t xml:space="preserve"> </w:t>
+      </w:r>
+      <w:r>
+        <w:rPr>
+          <w:i/>
+          <w:iCs/>
+        </w:rPr>
+        <w:t xml:space="preserve">code-LLMs</w:t>
+      </w:r>
+      <w:r>
+        <w:t xml:space="preserve"> </w:t>
+      </w:r>
+      <w:r>
+        <w:t xml:space="preserve">abertos servidos localmente, e demonstramos que o método pode ser replicado a custo financeiro nulo sem perda mensurável de desempenho. Sobre o subset estratificado de 200 consultas do Spider dev, o Qwen2.5-Coder-7B alcançou EX de 0,745, valor praticamente idêntico ao 0,742 relatado para o DIN-SQL com GPT-4. O intervalo de confiança bootstrap de 95% que obtivemos para esse modelo, [0,680, 0,805], contém o valor original, o que indica que a diferença entre ambos é indistinguível do ruído amostral. A comparação por dificuldade (Figura 7) detalha o quadro: o modelo aberto fica abaixo nas consultas</w:t>
       </w:r>
       <w:r>
         <w:t xml:space="preserve"> </w:t>
@@ -5651,7 +6308,7 @@
         <w:t xml:space="preserve">medium</w:t>
       </w:r>
       <w:r>
-        <w:t xml:space="preserve">, mas igualamos ou superamos o GPT-4 nas faixas</w:t>
+        <w:t xml:space="preserve">, mas iguala ou supera o GPT-4 nas faixas</w:t>
       </w:r>
       <w:r>
         <w:t xml:space="preserve"> </w:t>
@@ -5699,7 +6356,7 @@
         <w:t xml:space="preserve"> </w:t>
       </w:r>
       <w:r>
-        <w:t xml:space="preserve">aberto de cerca de 7B parâmetros, sob o pipeline DIN-SQL, atinge desempenho comparável ao de um modelo proprietário muito maior.</w:t>
+        <w:t xml:space="preserve">aberto de aproximadamente 7B parâmetros, operado sob o pipeline DIN-SQL, atinge desempenho comparável ao de um modelo proprietário substancialmente maior.</w:t>
       </w:r>
     </w:p>
     <w:p>
@@ -5707,7 +6364,7 @@
         <w:pStyle w:val="BodyText"/>
       </w:pPr>
       <w:r>
-        <w:t xml:space="preserve">Não nos limitamos a reproduzir. Acrescentamos o tratamento estatístico que faltava à avaliação original, partindo de uma matriz de acertos por consulta — um desenho pareado sobre as mesmas 200 instâncias. Sobre ela aplicamos testes adequados ao tipo de dado:</w:t>
+        <w:t xml:space="preserve">A contribuição deste estudo, contudo, não se restringe à reprodução. Acrescentamos o tratamento estatístico ausente na avaliação original, partindo de uma matriz de acertos por consulta — um desenho pareado sobre as mesmas 200 instâncias. Sobre essa matriz aplicamos testes adequados ao tipo de dado:</w:t>
       </w:r>
       <w:r>
         <w:t xml:space="preserve"> </w:t>
@@ -5723,7 +6380,7 @@
         <w:t xml:space="preserve"> </w:t>
       </w:r>
       <w:r>
-        <w:t xml:space="preserve">para os intervalos de confiança, McNemar para as comparações par-a-par, Friedman com correção de Bonferroni-Holm para o conjunto de</w:t>
+        <w:t xml:space="preserve">para os intervalos de confiança, McNemar para as comparações par a par, Friedman com correção de Bonferroni-Holm para o conjunto de</w:t>
       </w:r>
       <w:r>
         <w:t xml:space="preserve"> </w:t>
@@ -5736,7 +6393,10 @@
         <w:t xml:space="preserve">backbones</w:t>
       </w:r>
       <w:r>
-        <w:t xml:space="preserve">, e Shapiro-Wilk, Levene e Kruskal-Wallis para a robustez à temperatura. Essa camada nos permitiu separar diferenças reais do ruído amostral — distinção nada trivial num subset em que o erro-padrão ronda os três pontos percentuais.</w:t>
+        <w:t xml:space="preserve"> </w:t>
+      </w:r>
+      <w:r>
+        <w:t xml:space="preserve">e Shapiro-Wilk, Levene e Kruskal-Wallis para a robustez à temperatura. Essa camada de análise permitiu separar diferenças reais da variação amostral, distinção não trivial em um subset cujo erro-padrão é da ordem de três pontos percentuais.</w:t>
       </w:r>
     </w:p>
     <w:p>
@@ -5744,23 +6404,7 @@
         <w:pStyle w:val="BodyText"/>
       </w:pPr>
       <w:r>
-        <w:t xml:space="preserve">O achado central, contudo, não está na reprodução em si, mas no que ela revela sobre a anatomia do método. O</w:t>
-      </w:r>
-      <w:r>
-        <w:t xml:space="preserve"> </w:t>
-      </w:r>
-      <w:r>
-        <w:rPr>
-          <w:i/>
-          <w:iCs/>
-        </w:rPr>
-        <w:t xml:space="preserve">ablation</w:t>
-      </w:r>
-      <w:r>
-        <w:t xml:space="preserve"> </w:t>
-      </w:r>
-      <w:r>
-        <w:t xml:space="preserve">sobre o Qwen (Figuras 4 e 5) mostra que, dos módulos do DIN-SQL, apenas a</w:t>
+        <w:t xml:space="preserve">O achado central, entretanto, reside no que a reprodução revela sobre a anatomia do método, e não na reprodução em si. A ablação sobre o Qwen (Figuras 4 e 5) mostra que, dentre os módulos do DIN-SQL, apenas a</w:t>
       </w:r>
       <w:r>
         <w:t xml:space="preserve"> </w:t>
@@ -5776,7 +6420,7 @@
         <w:t xml:space="preserve"> </w:t>
       </w:r>
       <w:r>
-        <w:t xml:space="preserve">contribui de forma inequívoca: removê-la derruba o EX em oito pontos (delta -0,080; McNemar p &lt; 0,001; Cohen</w:t>
+        <w:t xml:space="preserve">contribui de forma inequívoca: removê-la reduz o EX em oito pontos (delta -0,080; McNemar p &lt; 0,001; Cohen</w:t>
       </w:r>
       <w:r>
         <w:t xml:space="preserve"> </w:t>
@@ -5853,7 +6497,7 @@
         <w:t xml:space="preserve"> </w:t>
       </w:r>
       <w:r>
-        <w:t xml:space="preserve">moderno (delta +0,020; p = 0,556). E há um resultado que vai além da neutralidade: forçar a classificação para o caminho mais simples de</w:t>
+        <w:t xml:space="preserve">moderno (delta +0,020; p = 0,556). Mais expressivo ainda, observamos um efeito que ultrapassa a mera neutralidade: forçar a classificação para o caminho mais simples de</w:t>
       </w:r>
       <w:r>
         <w:t xml:space="preserve"> </w:t>
@@ -5869,7 +6513,7 @@
         <w:t xml:space="preserve"> </w:t>
       </w:r>
       <w:r>
-        <w:t xml:space="preserve">chegou a melhorar o resultado geral (delta +0,045; p = 0,049), enquanto forçar o caminho de raciocínio decomposto o prejudicou (delta -0,070; p = 0,026). Em outras palavras, reproduzimos o desempenho do DIN-SQL, mas constatamos que</w:t>
+        <w:t xml:space="preserve">chegou a melhorar o resultado agregado (delta +0,045; p = 0,049), ao passo que forçar o caminho de raciocínio decomposto o prejudicou (delta -0,070; p = 0,026). Em síntese, reproduzimos o desempenho do DIN-SQL, mas constatamos que</w:t>
       </w:r>
       <w:r>
         <w:t xml:space="preserve"> </w:t>
@@ -5915,7 +6559,23 @@
         <w:t xml:space="preserve"> </w:t>
       </w:r>
       <w:r>
-        <w:t xml:space="preserve">em code-LLMs abertos atuais, que parecem internalizar o alinhamento entre esquema e pergunta. A maquinaria completa do método só compensa nas consultas extra-difíceis. Essa leitura sustenta apenas parcialmente H2 e dialoga com a tese de habilidade emergente do artigo original — tese reforçada pelo caso do SQLCoder-7B-2, um modelo de</w:t>
+        <w:t xml:space="preserve">em</w:t>
+      </w:r>
+      <w:r>
+        <w:t xml:space="preserve"> </w:t>
+      </w:r>
+      <w:r>
+        <w:rPr>
+          <w:i/>
+          <w:iCs/>
+        </w:rPr>
+        <w:t xml:space="preserve">code-LLMs</w:t>
+      </w:r>
+      <w:r>
+        <w:t xml:space="preserve"> </w:t>
+      </w:r>
+      <w:r>
+        <w:t xml:space="preserve">abertos atuais, que parecem internalizar o alinhamento entre esquema e pergunta. A maquinaria completa do método só compensa nas consultas extra-difíceis. Essa leitura sustenta apenas parcialmente H2 e dialoga com a tese de habilidade emergente do artigo original — tese reforçada pelo caso do SQLCoder-7B-2, um modelo de</w:t>
       </w:r>
       <w:r>
         <w:t xml:space="preserve"> </w:t>
@@ -5931,7 +6591,7 @@
         <w:t xml:space="preserve"> </w:t>
       </w:r>
       <w:r>
-        <w:t xml:space="preserve">especializado que sequer roda no pipeline de</w:t>
+        <w:t xml:space="preserve">especializado que sequer executa no pipeline de</w:t>
       </w:r>
       <w:r>
         <w:t xml:space="preserve"> </w:t>
@@ -5955,7 +6615,7 @@
         <w:pStyle w:val="BodyText"/>
       </w:pPr>
       <w:r>
-        <w:t xml:space="preserve">Quanto aos demais vereditos, observamos diferença global significativa entre os cinco</w:t>
+        <w:t xml:space="preserve">Quanto aos demais vereditos, constatamos diferença global significativa entre os cinco</w:t>
       </w:r>
       <w:r>
         <w:t xml:space="preserve"> </w:t>
@@ -5971,7 +6631,7 @@
         <w:t xml:space="preserve"> </w:t>
       </w:r>
       <w:r>
-        <w:t xml:space="preserve">(Friedman chi2 = 14,379; p = 0,0062), mas o</w:t>
+        <w:t xml:space="preserve">(Friedman chi2 = 14,379; p = 0,0062), embora o</w:t>
       </w:r>
       <w:r>
         <w:t xml:space="preserve"> </w:t>
@@ -5987,7 +6647,7 @@
         <w:t xml:space="preserve"> </w:t>
       </w:r>
       <w:r>
-        <w:t xml:space="preserve">mostra que essa diferença é puxada pelo Phi-3.5-mini (3,8B), o único par estatisticamente distinto do Qwen após a correção de Holm (p = 0,001; p_adj = 0,013; Cohen</w:t>
+        <w:t xml:space="preserve">indique que essa diferença é determinada pelo Phi-3.5-mini (3,8B), o único par estatisticamente distinto do Qwen após a correção de Holm (p = 0,001; p_adj = 0,013; Cohen</w:t>
       </w:r>
       <w:r>
         <w:t xml:space="preserve"> </w:t>
@@ -6019,7 +6679,7 @@
         <w:t xml:space="preserve"> </w:t>
       </w:r>
       <w:r>
-        <w:t xml:space="preserve">de 7 a 9B empatam entre si: Qwen contra DeepSeek (p = 0,890), contra Yi (p = 0,665) e, no limite, contra Granite (p = 0,050, que perde a significância após Holm). H3, portanto, é sustentada no agregado, mas com a nuance de que apenas o modelo menor se separa do grupo. Por fim, a análise de robustez confirma que a decodificação</w:t>
+        <w:t xml:space="preserve">de 7 a 9B empatam entre si: Qwen contra DeepSeek (p = 0,890), contra Yi (p = 0,665) e, no limiar, contra Granite (p = 0,050, que perde a significância após Holm). H3, portanto, é sustentada no agregado, com a ressalva de que apenas o modelo menor se separa do grupo. Por fim, a análise de robustez confirma que a decodificação</w:t>
       </w:r>
       <w:r>
         <w:t xml:space="preserve"> </w:t>
@@ -6035,7 +6695,7 @@
         <w:t xml:space="preserve"> </w:t>
       </w:r>
       <w:r>
-        <w:t xml:space="preserve">(temperatura 0) é a escolha segura e reprodutível: temperaturas mais altas não trouxeram ganho de média (Kruskal-Wallis p = 0,116) e o aumento de variância foi apenas numérico — o desvio sobe de ±0,020 em T = 0,4 para ±0,049 em T = 0,8, mas sem significância com N = 5 (Levene p = 0,273) —, o que sustenta H4.</w:t>
+        <w:t xml:space="preserve">(temperatura 0) é a escolha segura e reprodutível: temperaturas mais altas não produziram ganho de média (Kruskal-Wallis p = 0,116) e o aumento de variância foi apenas numérico — o desvio sobe de ±0,020 em T = 0,4 para ±0,049 em T = 0,8, mas sem significância com N = 5 (Levene p = 0,273) —, o que sustenta H4.</w:t>
       </w:r>
     </w:p>
     <w:p>
@@ -6043,7 +6703,7 @@
         <w:pStyle w:val="BodyText"/>
       </w:pPr>
       <w:r>
-        <w:t xml:space="preserve">Vários caminhos ficam em aberto. O mais imediato é o eixo de</w:t>
+        <w:t xml:space="preserve">Diversos caminhos permanecem em aberto. O mais imediato é o eixo de</w:t>
       </w:r>
       <w:r>
         <w:t xml:space="preserve"> </w:t>
@@ -6056,7 +6716,7 @@
         <w:t xml:space="preserve">few-shot</w:t>
       </w:r>
       <w:r>
-        <w:t xml:space="preserve">: como simplificar a classificação ajudou de forma limítrofe, vale isolar o efeito do número e da seleção de exemplos</w:t>
+        <w:t xml:space="preserve">: como a simplificação da classificação produziu ganho limítrofe, convém isolar o efeito do número e da seleção de exemplos</w:t>
       </w:r>
       <w:r>
         <w:t xml:space="preserve"> </w:t>
@@ -6069,23 +6729,7 @@
         <w:t xml:space="preserve">in-context</w:t>
       </w:r>
       <w:r>
-        <w:t xml:space="preserve">, hoje fixos no pipeline. Em segundo lugar, o nosso</w:t>
-      </w:r>
-      <w:r>
-        <w:t xml:space="preserve"> </w:t>
-      </w:r>
-      <w:r>
-        <w:rPr>
-          <w:i/>
-          <w:iCs/>
-        </w:rPr>
-        <w:t xml:space="preserve">ablation</w:t>
-      </w:r>
-      <w:r>
-        <w:t xml:space="preserve"> </w:t>
-      </w:r>
-      <w:r>
-        <w:t xml:space="preserve">concentrou-se no Qwen; estendê-lo aos demais</w:t>
+        <w:t xml:space="preserve">, hoje fixos no pipeline. Em segundo lugar, nossa ablação concentrou-se no Qwen; estendê-la aos demais</w:t>
       </w:r>
       <w:r>
         <w:t xml:space="preserve"> </w:t>
@@ -6117,7 +6761,7 @@
         <w:t xml:space="preserve"> </w:t>
       </w:r>
       <w:r>
-        <w:t xml:space="preserve">é uma propriedade geral dos</w:t>
+        <w:t xml:space="preserve">é propriedade geral dos</w:t>
       </w:r>
       <w:r>
         <w:t xml:space="preserve"> </w:t>
@@ -6133,7 +6777,7 @@
         <w:t xml:space="preserve"> </w:t>
       </w:r>
       <w:r>
-        <w:t xml:space="preserve">modernos ou particularidade de um único modelo. Seria igualmente proveitoso ampliar a avaliação para além do Spider — em especial para o BIRD, com esquemas maiores e mais ruidosos — e para outros idiomas, já que tanto o nosso estudo quanto o original se restringem ao inglês. Cada um desses eixos ataca uma das ameaças à validade que declaramos e ajudaria a delinear, com mais precisão, onde e para quem a decomposição do DIN-SQL ainda compensa.</w:t>
+        <w:t xml:space="preserve">modernos ou particularidade de um único modelo. Seria igualmente proveitoso ampliar a avaliação para além do Spider — em especial para o BIRD, com esquemas maiores e mais ruidosos — e para outros idiomas, dado que tanto o nosso estudo quanto o original se restringem ao inglês. Cada um desses eixos enfrenta uma das ameaças à validade declaradas e ajudaria a delinear, com maior precisão, onde e para quem a decomposição do DIN-SQL ainda compensa.</w:t>
       </w:r>
     </w:p>
     <w:bookmarkEnd w:id="61"/>
@@ -6151,7 +6795,23 @@
         <w:pStyle w:val="FirstParagraph"/>
       </w:pPr>
       <w:r>
-        <w:t xml:space="preserve">Todo o material necessário para reproduzir o estudo é público. O repositório reúne (i) o código do pipeline DIN-SQL adaptado e os</w:t>
+        <w:t xml:space="preserve">Todo o material necessário à reprodução do estudo é de acesso público. O repositório disponibiliza: (i) o código do</w:t>
+      </w:r>
+      <w:r>
+        <w:t xml:space="preserve"> </w:t>
+      </w:r>
+      <w:r>
+        <w:rPr>
+          <w:i/>
+          <w:iCs/>
+        </w:rPr>
+        <w:t xml:space="preserve">pipeline</w:t>
+      </w:r>
+      <w:r>
+        <w:t xml:space="preserve"> </w:t>
+      </w:r>
+      <w:r>
+        <w:t xml:space="preserve">DIN-SQL adaptado e os</w:t>
       </w:r>
       <w:r>
         <w:t xml:space="preserve"> </w:t>
@@ -6167,7 +6827,7 @@
         <w:t xml:space="preserve"> </w:t>
       </w:r>
       <w:r>
-        <w:t xml:space="preserve">de execução; (ii) a definição do subset determinístico — as 200 consultas estratificadas (easy 70, medium 70, hard 35, extra 25) com</w:t>
+        <w:t xml:space="preserve">de execução; (ii) a definição do subset determinístico, isto é, as 200 consultas estratificadas (easy 70, medium 70, hard 35, extra 25) geradas com</w:t>
       </w:r>
       <w:r>
         <w:t xml:space="preserve"> </w:t>
@@ -6182,7 +6842,7 @@
         <w:t xml:space="preserve"> </w:t>
       </w:r>
       <w:r>
-        <w:t xml:space="preserve">e hash de verificação</w:t>
+        <w:t xml:space="preserve">e identificadas pelo hash de verificação</w:t>
       </w:r>
       <w:r>
         <w:t xml:space="preserve"> </w:t>
@@ -6203,10 +6863,7 @@
         <w:t xml:space="preserve">setup_env.sh</w:t>
       </w:r>
       <w:r>
-        <w:t xml:space="preserve"> </w:t>
-      </w:r>
-      <w:r>
-        <w:t xml:space="preserve">com o vLLM pinado), que fixa o</w:t>
+        <w:t xml:space="preserve">, com a versão do vLLM fixada), que fixa o</w:t>
       </w:r>
       <w:r>
         <w:t xml:space="preserve"> </w:t>
@@ -6222,7 +6879,7 @@
         <w:t xml:space="preserve"> </w:t>
       </w:r>
       <w:r>
-        <w:t xml:space="preserve">em FP16 sobre a RTX 4090; (iv) os dados brutos de resultado (saídas por consulta e relatórios do avaliador oficial</w:t>
+        <w:t xml:space="preserve">em FP16 sobre a RTX 4090; (iv) os dados brutos de resultado, compostos pelas saídas por consulta e pelos relatórios do avaliador oficial</w:t>
       </w:r>
       <w:r>
         <w:t xml:space="preserve"> </w:t>
@@ -6234,7 +6891,7 @@
         <w:t xml:space="preserve">test-suite-sql-eval</w:t>
       </w:r>
       <w:r>
-        <w:t xml:space="preserve">); (v) as tabelas de análise estatística em</w:t>
+        <w:t xml:space="preserve">; (v) as tabelas de análise estatística, em</w:t>
       </w:r>
       <w:r>
         <w:t xml:space="preserve"> </w:t>
@@ -6246,7 +6903,7 @@
         <w:t xml:space="preserve">results/analysis/</w:t>
       </w:r>
       <w:r>
-        <w:t xml:space="preserve">; e (vi) as sete figuras do artigo em</w:t>
+        <w:t xml:space="preserve">; e (vi) as sete figuras do artigo, em</w:t>
       </w:r>
       <w:r>
         <w:t xml:space="preserve"> </w:t>
@@ -6258,7 +6915,7 @@
         <w:t xml:space="preserve">results/figures/</w:t>
       </w:r>
       <w:r>
-        <w:t xml:space="preserve">. A própria validação da infraestrutura está entre os artefatos: a avaliação</w:t>
+        <w:t xml:space="preserve">. A própria validação da infraestrutura integra os artefatos disponibilizados: a avaliação</w:t>
       </w:r>
       <w:r>
         <w:t xml:space="preserve"> </w:t>
@@ -6290,7 +6947,23 @@
         <w:t xml:space="preserve"> </w:t>
       </w:r>
       <w:r>
-        <w:t xml:space="preserve">reproduz exatamente o baseline de EX = 0,745.</w:t>
+        <w:t xml:space="preserve">reproduz exatamente o</w:t>
+      </w:r>
+      <w:r>
+        <w:t xml:space="preserve"> </w:t>
+      </w:r>
+      <w:r>
+        <w:rPr>
+          <w:i/>
+          <w:iCs/>
+        </w:rPr>
+        <w:t xml:space="preserve">baseline</w:t>
+      </w:r>
+      <w:r>
+        <w:t xml:space="preserve"> </w:t>
+      </w:r>
+      <w:r>
+        <w:t xml:space="preserve">de EX = 0,745.</w:t>
       </w:r>
     </w:p>
     <w:p>
@@ -6298,7 +6971,23 @@
         <w:pStyle w:val="BodyText"/>
       </w:pPr>
       <w:r>
-        <w:t xml:space="preserve">O pipeline de reprodução é encadeado em etapas, uma por comando, na seguinte ordem:</w:t>
+        <w:t xml:space="preserve">O</w:t>
+      </w:r>
+      <w:r>
+        <w:t xml:space="preserve"> </w:t>
+      </w:r>
+      <w:r>
+        <w:rPr>
+          <w:i/>
+          <w:iCs/>
+        </w:rPr>
+        <w:t xml:space="preserve">pipeline</w:t>
+      </w:r>
+      <w:r>
+        <w:t xml:space="preserve"> </w:t>
+      </w:r>
+      <w:r>
+        <w:t xml:space="preserve">de reprodução organiza-se em etapas sequenciais, uma por comando, na seguinte ordem:</w:t>
       </w:r>
     </w:p>
     <w:p>
@@ -6430,7 +7119,7 @@
         <w:t xml:space="preserve"> </w:t>
       </w:r>
       <w:r>
-        <w:t xml:space="preserve">usam decodificação</w:t>
+        <w:t xml:space="preserve">empregam decodificação</w:t>
       </w:r>
       <w:r>
         <w:t xml:space="preserve"> </w:t>
@@ -6446,7 +7135,7 @@
         <w:t xml:space="preserve"> </w:t>
       </w:r>
       <w:r>
-        <w:t xml:space="preserve">(temperatura 0), suas saídas são determinísticas e dispensam repetição; apenas o experimento de robustez (temperaturas 0,4 e 0,8) emprega N = 5 repetições, com</w:t>
+        <w:t xml:space="preserve">(temperatura 0), suas saídas são determinísticas e dispensam repetição; apenas o experimento de robustez (temperaturas 0,4 e 0,8) utiliza N = 5 repetições, com</w:t>
       </w:r>
       <w:r>
         <w:t xml:space="preserve"> </w:t>
@@ -6458,7 +7147,7 @@
         <w:t xml:space="preserve">seed=1..5</w:t>
       </w:r>
       <w:r>
-        <w:t xml:space="preserve">, igualmente reprodutíveis. Quem dispuser do hardware indicado deve, portanto, obter exatamente os números reportados nas Seções 4 a 6.</w:t>
+        <w:t xml:space="preserve">, igualmente reprodutíveis. Dispondo-se do hardware especificado, espera-se, portanto, a obtenção exata dos valores reportados nas Seções 4 a 6.</w:t>
       </w:r>
     </w:p>
     <w:bookmarkEnd w:id="62"/>
@@ -6476,6 +7165,126 @@
         <w:pStyle w:val="FirstParagraph"/>
       </w:pPr>
       <w:r>
+        <w:t xml:space="preserve">Abdin, M.; et al. (2024).</w:t>
+      </w:r>
+      <w:r>
+        <w:t xml:space="preserve"> </w:t>
+      </w:r>
+      <w:r>
+        <w:rPr>
+          <w:b/>
+          <w:bCs/>
+        </w:rPr>
+        <w:t xml:space="preserve">Phi-3 Technical Report: A Highly Capable Language Model Locally on Your Phone.</w:t>
+      </w:r>
+      <w:r>
+        <w:t xml:space="preserve"> </w:t>
+      </w:r>
+      <w:r>
+        <w:t xml:space="preserve">Microsoft. arXiv:2404.14219.</w:t>
+      </w:r>
+    </w:p>
+    <w:p>
+      <w:pPr>
+        <w:pStyle w:val="BodyText"/>
+      </w:pPr>
+      <w:r>
+        <w:t xml:space="preserve">Guo, D.; Zhu, Q.; Yang, D.; et al. (2024).</w:t>
+      </w:r>
+      <w:r>
+        <w:t xml:space="preserve"> </w:t>
+      </w:r>
+      <w:r>
+        <w:rPr>
+          <w:b/>
+          <w:bCs/>
+        </w:rPr>
+        <w:t xml:space="preserve">DeepSeek-Coder: When the Large Language Model Meets Programming — The Rise of Code Intelligence.</w:t>
+      </w:r>
+      <w:r>
+        <w:t xml:space="preserve"> </w:t>
+      </w:r>
+      <w:r>
+        <w:t xml:space="preserve">DeepSeek-AI. arXiv:2401.14196.</w:t>
+      </w:r>
+    </w:p>
+    <w:p>
+      <w:pPr>
+        <w:pStyle w:val="BodyText"/>
+      </w:pPr>
+      <w:r>
+        <w:t xml:space="preserve">Hui, B.; Yang, J.; et al. (2024).</w:t>
+      </w:r>
+      <w:r>
+        <w:t xml:space="preserve"> </w:t>
+      </w:r>
+      <w:r>
+        <w:rPr>
+          <w:b/>
+          <w:bCs/>
+        </w:rPr>
+        <w:t xml:space="preserve">Qwen2.5-Coder Technical Report.</w:t>
+      </w:r>
+      <w:r>
+        <w:t xml:space="preserve"> </w:t>
+      </w:r>
+      <w:r>
+        <w:t xml:space="preserve">Alibaba Group. arXiv:2409.12186.</w:t>
+      </w:r>
+    </w:p>
+    <w:p>
+      <w:pPr>
+        <w:pStyle w:val="BodyText"/>
+      </w:pPr>
+      <w:r>
+        <w:t xml:space="preserve">Kwon, W.; Li, Z.; Zhuang, S.; Sheng, Y.; Zheng, L.; Yu, C. H.; Gonzalez, J. E.; Zhang, H.; Stoica, I. (2023).</w:t>
+      </w:r>
+      <w:r>
+        <w:t xml:space="preserve"> </w:t>
+      </w:r>
+      <w:r>
+        <w:rPr>
+          <w:b/>
+          <w:bCs/>
+        </w:rPr>
+        <w:t xml:space="preserve">Efficient Memory Management for Large Language Model Serving with PagedAttention (vLLM).</w:t>
+      </w:r>
+      <w:r>
+        <w:t xml:space="preserve"> </w:t>
+      </w:r>
+      <w:r>
+        <w:t xml:space="preserve">In: Proceedings of the ACM Symposium on Operating Systems Principles (SOSP), 2023.</w:t>
+      </w:r>
+    </w:p>
+    <w:p>
+      <w:pPr>
+        <w:pStyle w:val="BodyText"/>
+      </w:pPr>
+      <w:r>
+        <w:t xml:space="preserve">Mishra, M.; Stallone, M.; et al. (2024).</w:t>
+      </w:r>
+      <w:r>
+        <w:t xml:space="preserve"> </w:t>
+      </w:r>
+      <w:r>
+        <w:rPr>
+          <w:b/>
+          <w:bCs/>
+        </w:rPr>
+        <w:t xml:space="preserve">Granite Code Models: A Family of Open Foundation Models for Code Intelligence.</w:t>
+      </w:r>
+      <w:r>
+        <w:t xml:space="preserve"> </w:t>
+      </w:r>
+      <w:r>
+        <w:t xml:space="preserve">IBM Research. arXiv:2405.04324.</w:t>
+      </w:r>
+    </w:p>
+    <w:p>
+      <w:pPr>
+        <w:pStyle w:val="BodyText"/>
+      </w:pPr>
+      <w:r>
         <w:t xml:space="preserve">Pourreza, M.; Rafiei, D. (2023).</w:t>
       </w:r>
       <w:r>
@@ -6548,54 +7357,6 @@
         <w:pStyle w:val="BodyText"/>
       </w:pPr>
       <w:r>
-        <w:t xml:space="preserve">Hui, B.; Yang, J.; et al. (2024).</w:t>
-      </w:r>
-      <w:r>
-        <w:t xml:space="preserve"> </w:t>
-      </w:r>
-      <w:r>
-        <w:rPr>
-          <w:b/>
-          <w:bCs/>
-        </w:rPr>
-        <w:t xml:space="preserve">Qwen2.5-Coder Technical Report.</w:t>
-      </w:r>
-      <w:r>
-        <w:t xml:space="preserve"> </w:t>
-      </w:r>
-      <w:r>
-        <w:t xml:space="preserve">Alibaba Group. arXiv:2409.12186.</w:t>
-      </w:r>
-    </w:p>
-    <w:p>
-      <w:pPr>
-        <w:pStyle w:val="BodyText"/>
-      </w:pPr>
-      <w:r>
-        <w:t xml:space="preserve">Guo, D.; Zhu, Q.; Yang, D.; et al. (2024).</w:t>
-      </w:r>
-      <w:r>
-        <w:t xml:space="preserve"> </w:t>
-      </w:r>
-      <w:r>
-        <w:rPr>
-          <w:b/>
-          <w:bCs/>
-        </w:rPr>
-        <w:t xml:space="preserve">DeepSeek-Coder: When the Large Language Model Meets Programming — The Rise of Code Intelligence.</w:t>
-      </w:r>
-      <w:r>
-        <w:t xml:space="preserve"> </w:t>
-      </w:r>
-      <w:r>
-        <w:t xml:space="preserve">DeepSeek-AI. arXiv:2401.14196.</w:t>
-      </w:r>
-    </w:p>
-    <w:p>
-      <w:pPr>
-        <w:pStyle w:val="BodyText"/>
-      </w:pPr>
-      <w:r>
         <w:t xml:space="preserve">01.AI (2024).</w:t>
       </w:r>
       <w:r>
@@ -6613,78 +7374,6 @@
       </w:r>
       <w:r>
         <w:t xml:space="preserve">01.AI Technical Blog/Report.</w:t>
-      </w:r>
-    </w:p>
-    <w:p>
-      <w:pPr>
-        <w:pStyle w:val="BodyText"/>
-      </w:pPr>
-      <w:r>
-        <w:t xml:space="preserve">Mishra, M.; Stallone, M.; et al. (2024).</w:t>
-      </w:r>
-      <w:r>
-        <w:t xml:space="preserve"> </w:t>
-      </w:r>
-      <w:r>
-        <w:rPr>
-          <w:b/>
-          <w:bCs/>
-        </w:rPr>
-        <w:t xml:space="preserve">Granite Code Models: A Family of Open Foundation Models for Code Intelligence.</w:t>
-      </w:r>
-      <w:r>
-        <w:t xml:space="preserve"> </w:t>
-      </w:r>
-      <w:r>
-        <w:t xml:space="preserve">IBM Research. arXiv:2405.04324.</w:t>
-      </w:r>
-    </w:p>
-    <w:p>
-      <w:pPr>
-        <w:pStyle w:val="BodyText"/>
-      </w:pPr>
-      <w:r>
-        <w:t xml:space="preserve">Abdin, M.; et al. (2024).</w:t>
-      </w:r>
-      <w:r>
-        <w:t xml:space="preserve"> </w:t>
-      </w:r>
-      <w:r>
-        <w:rPr>
-          <w:b/>
-          <w:bCs/>
-        </w:rPr>
-        <w:t xml:space="preserve">Phi-3 Technical Report: A Highly Capable Language Model Locally on Your Phone.</w:t>
-      </w:r>
-      <w:r>
-        <w:t xml:space="preserve"> </w:t>
-      </w:r>
-      <w:r>
-        <w:t xml:space="preserve">Microsoft. arXiv:2404.14219.</w:t>
-      </w:r>
-    </w:p>
-    <w:p>
-      <w:pPr>
-        <w:pStyle w:val="BodyText"/>
-      </w:pPr>
-      <w:r>
-        <w:t xml:space="preserve">Kwon, W.; Li, Z.; Zhuang, S.; Sheng, Y.; Zheng, L.; Yu, C. H.; Gonzalez, J. E.; Zhang, H.; Stoica, I. (2023).</w:t>
-      </w:r>
-      <w:r>
-        <w:t xml:space="preserve"> </w:t>
-      </w:r>
-      <w:r>
-        <w:rPr>
-          <w:b/>
-          <w:bCs/>
-        </w:rPr>
-        <w:t xml:space="preserve">Efficient Memory Management for Large Language Model Serving with PagedAttention (vLLM).</w:t>
-      </w:r>
-      <w:r>
-        <w:t xml:space="preserve"> </w:t>
-      </w:r>
-      <w:r>
-        <w:t xml:space="preserve">In: Proceedings of the ACM Symposium on Operating Systems Principles (SOSP), 2023.</w:t>
       </w:r>
     </w:p>
     <w:bookmarkEnd w:id="63"/>
@@ -7023,6 +7712,9 @@
     </w:lvlOverride>
   </w:num>
   <w:num w:numId="1003">
+    <w:abstractNumId w:val="991"/>
+  </w:num>
+  <w:num w:numId="1004">
     <w:abstractNumId w:val="991"/>
   </w:num>
 </w:numbering>

</xml_diff>

<commit_message>
Artigo: titulo em ingles + secao 3.3 esclarece holdout test set vs dev
</commit_message>
<xml_diff>
--- a/ARTIGO.docx
+++ b/ARTIGO.docx
@@ -2,13 +2,13 @@
 <file path=word/document.xml><?xml version="1.0" encoding="utf-8"?>
 <w:document xmlns:w="http://schemas.openxmlformats.org/wordprocessingml/2006/main" xmlns:m="http://schemas.openxmlformats.org/officeDocument/2006/math" xmlns:r="http://schemas.openxmlformats.org/officeDocument/2006/relationships" xmlns:o="urn:schemas-microsoft-com:office:office" xmlns:v="urn:schemas-microsoft-com:vml" xmlns:w10="urn:schemas-microsoft-com:office:word" xmlns:a="http://schemas.openxmlformats.org/drawingml/2006/main" xmlns:pic="http://schemas.openxmlformats.org/drawingml/2006/picture" xmlns:wp="http://schemas.openxmlformats.org/drawingml/2006/wordprocessingDrawing">
   <w:body>
-    <w:bookmarkStart w:id="11" w:name="X15270d857d36193a0db28ae6b38ef0584c15a02"/>
+    <w:bookmarkStart w:id="11" w:name="Xabe025ec5d258723b45f4091ea2b0d9b1cd40a9"/>
     <w:p>
       <w:pPr>
         <w:pStyle w:val="Heading1"/>
       </w:pPr>
       <w:r>
-        <w:t xml:space="preserve">Reprodução de baixo custo do DIN-SQL: quão necessário é o prompting decomposto em code-LLMs abertos modernos?</w:t>
+        <w:t xml:space="preserve">A Low-Cost Reproduction of DIN-SQL: How Necessary Is Decomposed Prompting for Modern Open Code-LLMs?</w:t>
       </w:r>
     </w:p>
     <w:p>
@@ -2103,6 +2103,72 @@
     <w:p>
       <w:pPr>
         <w:pStyle w:val="FirstParagraph"/>
+      </w:pPr>
+      <w:r>
+        <w:rPr>
+          <w:b/>
+          <w:bCs/>
+        </w:rPr>
+        <w:t xml:space="preserve">Conjunto de avaliação.</w:t>
+      </w:r>
+      <w:r>
+        <w:t xml:space="preserve"> </w:t>
+      </w:r>
+      <w:r>
+        <w:t xml:space="preserve">O conjunto de teste do Spider é um</w:t>
+      </w:r>
+      <w:r>
+        <w:t xml:space="preserve"> </w:t>
+      </w:r>
+      <w:r>
+        <w:rPr>
+          <w:i/>
+          <w:iCs/>
+        </w:rPr>
+        <w:t xml:space="preserve">holdout</w:t>
+      </w:r>
+      <w:r>
+        <w:t xml:space="preserve"> </w:t>
+      </w:r>
+      <w:r>
+        <w:t xml:space="preserve">oculto, avaliável exclusivamente pelo servidor oficial dos organizadores — tanto que o artigo original agradece nominalmente à equipe do Spider por executar seu código sobre esse conjunto, justamente por ele não ser acessível de forma autônoma. Assim, à semelhança da avaliação de</w:t>
+      </w:r>
+      <w:r>
+        <w:t xml:space="preserve"> </w:t>
+      </w:r>
+      <w:r>
+        <w:rPr>
+          <w:i/>
+          <w:iCs/>
+        </w:rPr>
+        <w:t xml:space="preserve">dev</w:t>
+      </w:r>
+      <w:r>
+        <w:t xml:space="preserve"> </w:t>
+      </w:r>
+      <w:r>
+        <w:t xml:space="preserve">do trabalho de referência e de qualquer estudo sem acesso ao servidor, restringimos nossos experimentos ao conjunto de desenvolvimento (1.034 consultas), de acesso público, adotando como alvo de comparação os números de</w:t>
+      </w:r>
+      <w:r>
+        <w:t xml:space="preserve"> </w:t>
+      </w:r>
+      <w:r>
+        <w:rPr>
+          <w:i/>
+          <w:iCs/>
+        </w:rPr>
+        <w:t xml:space="preserve">dev</w:t>
+      </w:r>
+      <w:r>
+        <w:t xml:space="preserve"> </w:t>
+      </w:r>
+      <w:r>
+        <w:t xml:space="preserve">reportados pelos autores.</w:t>
+      </w:r>
+    </w:p>
+    <w:p>
+      <w:pPr>
+        <w:pStyle w:val="BodyText"/>
       </w:pPr>
       <w:r>
         <w:rPr>

</xml_diff>

<commit_message>
Artigo: insere link do repositorio publico na secao 8 (Reprodutibilidade)
</commit_message>
<xml_diff>
--- a/ARTIGO.docx
+++ b/ARTIGO.docx
@@ -6847,7 +6847,7 @@
       </w:r>
     </w:p>
     <w:bookmarkEnd w:id="61"/>
-    <w:bookmarkStart w:id="62" w:name="X294a4d52a25cc490bd3247eb71555f7bbe1912f"/>
+    <w:bookmarkStart w:id="63" w:name="X294a4d52a25cc490bd3247eb71555f7bbe1912f"/>
     <w:p>
       <w:pPr>
         <w:pStyle w:val="Heading1"/>
@@ -6861,7 +6861,21 @@
         <w:pStyle w:val="FirstParagraph"/>
       </w:pPr>
       <w:r>
-        <w:t xml:space="preserve">Todo o material necessário à reprodução do estudo é de acesso público. O repositório disponibiliza: (i) o código do</w:t>
+        <w:t xml:space="preserve">Todo o material necessário à reprodução do estudo é de acesso público e está reunido no repositório do projeto, disponível em</w:t>
+      </w:r>
+      <w:r>
+        <w:t xml:space="preserve"> </w:t>
+      </w:r>
+      <w:hyperlink r:id="rId62">
+        <w:r>
+          <w:rPr>
+            <w:rStyle w:val="Hyperlink"/>
+          </w:rPr>
+          <w:t xml:space="preserve">https://github.com/gabrieldantasoli/DIN-SQL</w:t>
+        </w:r>
+      </w:hyperlink>
+      <w:r>
+        <w:t xml:space="preserve">. O repositório disponibiliza: (i) o código do</w:t>
       </w:r>
       <w:r>
         <w:t xml:space="preserve"> </w:t>
@@ -7213,11 +7227,38 @@
         <w:t xml:space="preserve">seed=1..5</w:t>
       </w:r>
       <w:r>
-        <w:t xml:space="preserve">, igualmente reprodutíveis. Dispondo-se do hardware especificado, espera-se, portanto, a obtenção exata dos valores reportados nas Seções 4 a 6.</w:t>
-      </w:r>
-    </w:p>
-    <w:bookmarkEnd w:id="62"/>
-    <w:bookmarkStart w:id="63" w:name="referências"/>
+        <w:t xml:space="preserve">, igualmente reprodutíveis. Dispondo-se do hardware especificado, espera-se, portanto, a obtenção exata dos valores reportados nas Seções 4 a 6. O código, os</w:t>
+      </w:r>
+      <w:r>
+        <w:t xml:space="preserve"> </w:t>
+      </w:r>
+      <w:r>
+        <w:rPr>
+          <w:i/>
+          <w:iCs/>
+        </w:rPr>
+        <w:t xml:space="preserve">scripts</w:t>
+      </w:r>
+      <w:r>
+        <w:t xml:space="preserve">, o subset determinístico, a especificação do ambiente e os dados de resultado encontram-se versionados no repositório público</w:t>
+      </w:r>
+      <w:r>
+        <w:t xml:space="preserve"> </w:t>
+      </w:r>
+      <w:hyperlink r:id="rId62">
+        <w:r>
+          <w:rPr>
+            <w:rStyle w:val="Hyperlink"/>
+          </w:rPr>
+          <w:t xml:space="preserve">https://github.com/gabrieldantasoli/DIN-SQL</w:t>
+        </w:r>
+      </w:hyperlink>
+      <w:r>
+        <w:t xml:space="preserve">.</w:t>
+      </w:r>
+    </w:p>
+    <w:bookmarkEnd w:id="63"/>
+    <w:bookmarkStart w:id="64" w:name="referências"/>
     <w:p>
       <w:pPr>
         <w:pStyle w:val="Heading1"/>
@@ -7442,7 +7483,7 @@
         <w:t xml:space="preserve">01.AI Technical Blog/Report.</w:t>
       </w:r>
     </w:p>
-    <w:bookmarkEnd w:id="63"/>
+    <w:bookmarkEnd w:id="64"/>
     <w:sectPr>
       <w:footnotePr>
         <w:numRestart w:val="eachSect"/>

</xml_diff>